<commit_message>
Update resume PDF and DOCX files.
</commit_message>
<xml_diff>
--- a/assets/Hassan-Amin-CV-Resume.docx
+++ b/assets/Hassan-Amin-CV-Resume.docx
@@ -91,9 +91,71 @@
           <w:vertAlign w:val="baseline"/>
           <w:rtl w:val="0"/>
         </w:rPr>
-        <w:t xml:space="preserve">Egypt  | +201066874777  |  hassan.amin.elsayed@gmail.com | </w:t>
+        <w:t xml:space="preserve">Egypt | +201066874777</w:t>
+      </w:r>
+      <w:r>
+        <w:rPr>
+          <w:rFonts w:ascii="Calibri" w:cs="Calibri" w:eastAsia="Calibri" w:hAnsi="Calibri"/>
+          <w:rtl w:val="0"/>
+        </w:rPr>
+        <w:t xml:space="preserve"> </w:t>
+      </w:r>
+      <w:r>
+        <w:rPr>
+          <w:rFonts w:ascii="Calibri" w:cs="Calibri" w:eastAsia="Calibri" w:hAnsi="Calibri"/>
+          <w:color w:val="000000"/>
+          <w:sz w:val="20"/>
+          <w:szCs w:val="20"/>
+          <w:shd w:fill="auto" w:val="clear"/>
+          <w:vertAlign w:val="baseline"/>
+          <w:rtl w:val="0"/>
+        </w:rPr>
+        <w:t xml:space="preserve">|</w:t>
+      </w:r>
+      <w:r>
+        <w:rPr>
+          <w:rFonts w:ascii="Calibri" w:cs="Calibri" w:eastAsia="Calibri" w:hAnsi="Calibri"/>
+          <w:color w:val="0000ff"/>
+          <w:rtl w:val="0"/>
+        </w:rPr>
+        <w:t xml:space="preserve"> </w:t>
       </w:r>
       <w:hyperlink r:id="rId6">
+        <w:r>
+          <w:rPr>
+            <w:rFonts w:ascii="Calibri" w:cs="Calibri" w:eastAsia="Calibri" w:hAnsi="Calibri"/>
+            <w:color w:val="0000ff"/>
+            <w:sz w:val="20"/>
+            <w:szCs w:val="20"/>
+            <w:u w:val="single"/>
+            <w:shd w:fill="auto" w:val="clear"/>
+            <w:vertAlign w:val="baseline"/>
+            <w:rtl w:val="0"/>
+          </w:rPr>
+          <w:t xml:space="preserve">hassan.amin.elsayed@gmail.com</w:t>
+        </w:r>
+      </w:hyperlink>
+      <w:r>
+        <w:rPr>
+          <w:rFonts w:ascii="Calibri" w:cs="Calibri" w:eastAsia="Calibri" w:hAnsi="Calibri"/>
+          <w:color w:val="0000ff"/>
+          <w:rtl w:val="0"/>
+        </w:rPr>
+        <w:t xml:space="preserve"> </w:t>
+      </w:r>
+      <w:r>
+        <w:rPr>
+          <w:rFonts w:ascii="Calibri" w:cs="Calibri" w:eastAsia="Calibri" w:hAnsi="Calibri"/>
+          <w:color w:val="000000"/>
+          <w:sz w:val="20"/>
+          <w:szCs w:val="20"/>
+          <w:shd w:fill="auto" w:val="clear"/>
+          <w:vertAlign w:val="baseline"/>
+          <w:rtl w:val="0"/>
+        </w:rPr>
+        <w:t xml:space="preserve">| </w:t>
+      </w:r>
+      <w:hyperlink r:id="rId7">
         <w:r>
           <w:rPr>
             <w:rFonts w:ascii="Calibri" w:cs="Calibri" w:eastAsia="Calibri" w:hAnsi="Calibri"/>
@@ -118,9 +180,16 @@
           <w:vertAlign w:val="baseline"/>
           <w:rtl w:val="0"/>
         </w:rPr>
-        <w:t xml:space="preserve"> | </w:t>
-      </w:r>
-      <w:hyperlink r:id="rId7">
+        <w:t xml:space="preserve"> |</w:t>
+      </w:r>
+      <w:r>
+        <w:rPr>
+          <w:rFonts w:ascii="Calibri" w:cs="Calibri" w:eastAsia="Calibri" w:hAnsi="Calibri"/>
+          <w:rtl w:val="0"/>
+        </w:rPr>
+        <w:t xml:space="preserve"> </w:t>
+      </w:r>
+      <w:hyperlink r:id="rId8">
         <w:r>
           <w:rPr>
             <w:rFonts w:ascii="Calibri" w:cs="Calibri" w:eastAsia="Calibri" w:hAnsi="Calibri"/>
@@ -504,7 +573,7 @@
           <w:szCs w:val="22"/>
           <w:rtl w:val="0"/>
         </w:rPr>
-        <w:t xml:space="preserve">AI Tools: V0, Loveable, Bolt, Gemini, ChatGPT, Grok, Claude, Cursor, NotebookLM.</w:t>
+        <w:t xml:space="preserve">AI Tools: V0, Lovable, Bolt, Gemini, ChatGPT, Grok, Claude, Cursor, NotebookLM.</w:t>
         <w:br w:type="textWrapping"/>
       </w:r>
       <w:r>
@@ -621,16 +690,17 @@
           <w:rFonts w:ascii="Calibri" w:cs="Calibri" w:eastAsia="Calibri" w:hAnsi="Calibri"/>
           <w:sz w:val="22"/>
           <w:szCs w:val="22"/>
-        </w:rPr>
-      </w:pPr>
-      <w:r>
-        <w:rPr>
-          <w:rFonts w:ascii="Calibri" w:cs="Calibri" w:eastAsia="Calibri" w:hAnsi="Calibri"/>
-          <w:sz w:val="22"/>
-          <w:szCs w:val="22"/>
-          <w:rtl w:val="0"/>
-        </w:rPr>
-        <w:t xml:space="preserve">Translating user needs into intuitive high-fidelity designs and prototypes that prioritize clean data, accessibility, and localization.</w:t>
+          <w:u w:val="none"/>
+        </w:rPr>
+      </w:pPr>
+      <w:r>
+        <w:rPr>
+          <w:rFonts w:ascii="Calibri" w:cs="Calibri" w:eastAsia="Calibri" w:hAnsi="Calibri"/>
+          <w:sz w:val="22"/>
+          <w:szCs w:val="22"/>
+          <w:rtl w:val="0"/>
+        </w:rPr>
+        <w:t xml:space="preserve">Spearhead the end-to-end design of intuitive, high-fidelity interfaces, prioritizing data clarity, WCAG accessibility, and localization for enterprise construction management tools.</w:t>
       </w:r>
     </w:p>
     <w:p>
@@ -659,7 +729,7 @@
           <w:szCs w:val="22"/>
           <w:rtl w:val="0"/>
         </w:rPr>
-        <w:t xml:space="preserve">Spearhead the end-to-end design of intuitive, high-fidelity interfaces, prioritizing data clarity, WCAG accessibility, and localization for enterprise construction management tools.</w:t>
+        <w:t xml:space="preserve">Accelerate design-to-development workflows by leveraging AI tools (Claude, Cursor, NotebookLM) to build seamless prototypes and assist in foundational coding.</w:t>
       </w:r>
     </w:p>
     <w:p>
@@ -688,7 +758,7 @@
           <w:szCs w:val="22"/>
           <w:rtl w:val="0"/>
         </w:rPr>
-        <w:t xml:space="preserve">Accelerate design-to-development workflows by leveraging AI tools (Claude, Cursor, NotebookLM) to build seamless prototypes and assist in foundational coding.</w:t>
+        <w:t xml:space="preserve">Partner with UX researchers to conduct generative studies and usability tests, utilizing data-driven insights to refine solutions prior to production release.</w:t>
       </w:r>
     </w:p>
     <w:p>
@@ -717,7 +787,70 @@
           <w:szCs w:val="22"/>
           <w:rtl w:val="0"/>
         </w:rPr>
-        <w:t xml:space="preserve">Partner with UX researchers to conduct generative studies and usability tests, utilizing data-driven insights to refine solutions prior to production release.</w:t>
+        <w:t xml:space="preserve">Contribute scalable, reusable components to the global shared Design System, ensuring UI consistency across multiple product modules.</w:t>
+      </w:r>
+    </w:p>
+    <w:p>
+      <w:pPr>
+        <w:spacing w:after="160" w:line="259" w:lineRule="auto"/>
+        <w:rPr>
+          <w:rFonts w:ascii="Calibri" w:cs="Calibri" w:eastAsia="Calibri" w:hAnsi="Calibri"/>
+          <w:b w:val="1"/>
+          <w:bCs w:val="1"/>
+          <w:sz w:val="22"/>
+          <w:szCs w:val="22"/>
+        </w:rPr>
+      </w:pPr>
+      <w:r>
+        <w:rPr>
+          <w:rFonts w:ascii="Calibri" w:cs="Calibri" w:eastAsia="Calibri" w:hAnsi="Calibri"/>
+          <w:b w:val="1"/>
+          <w:bCs w:val="1"/>
+          <w:sz w:val="22"/>
+          <w:szCs w:val="22"/>
+          <w:rtl w:val="0"/>
+        </w:rPr>
+        <w:br w:type="textWrapping"/>
+        <w:br w:type="textWrapping"/>
+        <w:t xml:space="preserve">Deloitte | Senior Product Designer</w:t>
+        <w:br w:type="textWrapping"/>
+        <w:br w:type="textWrapping"/>
+      </w:r>
+      <w:r>
+        <w:rPr>
+          <w:rFonts w:ascii="Calibri" w:cs="Calibri" w:eastAsia="Calibri" w:hAnsi="Calibri"/>
+          <w:color w:val="767171"/>
+          <w:rtl w:val="0"/>
+        </w:rPr>
+        <w:t xml:space="preserve">January  2025 – December 2025 | Freelance</w:t>
+      </w:r>
+      <w:r>
+        <w:rPr>
+          <w:rtl w:val="0"/>
+        </w:rPr>
+      </w:r>
+    </w:p>
+    <w:p>
+      <w:pPr>
+        <w:tabs>
+          <w:tab w:val="left" w:leader="none" w:pos="1418"/>
+          <w:tab w:val="right" w:leader="none" w:pos="10503"/>
+        </w:tabs>
+        <w:spacing w:after="80" w:line="259" w:lineRule="auto"/>
+        <w:rPr>
+          <w:rFonts w:ascii="Calibri" w:cs="Calibri" w:eastAsia="Calibri" w:hAnsi="Calibri"/>
+          <w:sz w:val="22"/>
+          <w:szCs w:val="22"/>
+        </w:rPr>
+      </w:pPr>
+      <w:r>
+        <w:rPr>
+          <w:rFonts w:ascii="Calibri" w:cs="Calibri" w:eastAsia="Calibri" w:hAnsi="Calibri"/>
+          <w:sz w:val="22"/>
+          <w:szCs w:val="22"/>
+          <w:rtl w:val="0"/>
+        </w:rPr>
+        <w:t xml:space="preserve">Responsibilities:</w:t>
       </w:r>
     </w:p>
     <w:p>
@@ -746,70 +879,12 @@
           <w:szCs w:val="22"/>
           <w:rtl w:val="0"/>
         </w:rPr>
-        <w:t xml:space="preserve">Contribute scalable, reusable components to the global shared Design System, ensuring UI consistency across multiple product modules.</w:t>
-      </w:r>
-    </w:p>
-    <w:p>
-      <w:pPr>
-        <w:spacing w:after="160" w:line="259" w:lineRule="auto"/>
-        <w:rPr>
-          <w:rFonts w:ascii="Calibri" w:cs="Calibri" w:eastAsia="Calibri" w:hAnsi="Calibri"/>
-          <w:b w:val="1"/>
-          <w:bCs w:val="1"/>
-          <w:sz w:val="22"/>
-          <w:szCs w:val="22"/>
-        </w:rPr>
-      </w:pPr>
-      <w:r>
-        <w:rPr>
-          <w:rFonts w:ascii="Calibri" w:cs="Calibri" w:eastAsia="Calibri" w:hAnsi="Calibri"/>
-          <w:b w:val="1"/>
-          <w:bCs w:val="1"/>
-          <w:sz w:val="22"/>
-          <w:szCs w:val="22"/>
-          <w:rtl w:val="0"/>
-        </w:rPr>
-        <w:br w:type="textWrapping"/>
-        <w:br w:type="textWrapping"/>
-        <w:t xml:space="preserve">Deloitte | Senior Product Designer</w:t>
-        <w:br w:type="textWrapping"/>
-        <w:br w:type="textWrapping"/>
-      </w:r>
-      <w:r>
-        <w:rPr>
-          <w:rFonts w:ascii="Calibri" w:cs="Calibri" w:eastAsia="Calibri" w:hAnsi="Calibri"/>
-          <w:color w:val="767171"/>
-          <w:rtl w:val="0"/>
-        </w:rPr>
-        <w:t xml:space="preserve">January  2025 – December 2025 | Freelance</w:t>
-      </w:r>
-      <w:r>
-        <w:rPr>
-          <w:rtl w:val="0"/>
-        </w:rPr>
-      </w:r>
-    </w:p>
-    <w:p>
-      <w:pPr>
-        <w:tabs>
-          <w:tab w:val="left" w:leader="none" w:pos="1418"/>
-          <w:tab w:val="right" w:leader="none" w:pos="10503"/>
-        </w:tabs>
-        <w:spacing w:after="80" w:line="259" w:lineRule="auto"/>
-        <w:rPr>
-          <w:rFonts w:ascii="Calibri" w:cs="Calibri" w:eastAsia="Calibri" w:hAnsi="Calibri"/>
-          <w:sz w:val="22"/>
-          <w:szCs w:val="22"/>
-        </w:rPr>
-      </w:pPr>
-      <w:r>
-        <w:rPr>
-          <w:rFonts w:ascii="Calibri" w:cs="Calibri" w:eastAsia="Calibri" w:hAnsi="Calibri"/>
-          <w:sz w:val="22"/>
-          <w:szCs w:val="22"/>
-          <w:rtl w:val="0"/>
-        </w:rPr>
-        <w:t xml:space="preserve">Responsibilities:</w:t>
+        <w:t xml:space="preserve">Enhanced the KSA Capital Market Authority design system by building scalable components to ensure consistency.</w:t>
+      </w:r>
+      <w:r>
+        <w:rPr>
+          <w:rtl w:val="0"/>
+        </w:rPr>
       </w:r>
     </w:p>
     <w:p>
@@ -838,7 +913,7 @@
           <w:szCs w:val="22"/>
           <w:rtl w:val="0"/>
         </w:rPr>
-        <w:t xml:space="preserve">Enhanced the KSA Capital Market Authority design system by building scalable components to ensure consistency.</w:t>
+        <w:t xml:space="preserve">Collaborated with the design &amp; product team to execute high-fidelity wireframes and user interface layouts.</w:t>
       </w:r>
       <w:r>
         <w:rPr>
@@ -872,65 +947,231 @@
           <w:szCs w:val="22"/>
           <w:rtl w:val="0"/>
         </w:rPr>
-        <w:t xml:space="preserve">Collaborated with the design &amp; product team to execute high-fidelity wireframes and user interface layouts.</w:t>
-      </w:r>
-      <w:r>
-        <w:rPr>
-          <w:rtl w:val="0"/>
-        </w:rPr>
+        <w:t xml:space="preserve">Delivered successful design solutions that strictly aligned with client needs and business requirements.</w:t>
+        <w:br w:type="textWrapping"/>
+      </w:r>
+      <w:r>
+        <w:rPr>
+          <w:rtl w:val="0"/>
+        </w:rPr>
+      </w:r>
+    </w:p>
+    <w:p>
+      <w:pPr>
+        <w:spacing w:after="160" w:line="259" w:lineRule="auto"/>
+        <w:rPr>
+          <w:rFonts w:ascii="Calibri" w:cs="Calibri" w:eastAsia="Calibri" w:hAnsi="Calibri"/>
+          <w:color w:val="767171"/>
+        </w:rPr>
+      </w:pPr>
+      <w:r>
+        <w:rPr>
+          <w:rFonts w:ascii="Calibri" w:cs="Calibri" w:eastAsia="Calibri" w:hAnsi="Calibri"/>
+          <w:b w:val="1"/>
+          <w:bCs w:val="1"/>
+          <w:sz w:val="22"/>
+          <w:szCs w:val="22"/>
+          <w:rtl w:val="0"/>
+        </w:rPr>
+        <w:t xml:space="preserve">Path2Live | Senior Product Designer </w:t>
+        <w:br w:type="textWrapping"/>
+        <w:br w:type="textWrapping"/>
+      </w:r>
+      <w:r>
+        <w:rPr>
+          <w:rFonts w:ascii="Calibri" w:cs="Calibri" w:eastAsia="Calibri" w:hAnsi="Calibri"/>
+          <w:color w:val="767171"/>
+          <w:rtl w:val="0"/>
+        </w:rPr>
+        <w:t xml:space="preserve">March 2024 – December 2024 | Parti-time</w:t>
+      </w:r>
+    </w:p>
+    <w:p>
+      <w:pPr>
+        <w:spacing w:after="160" w:line="259" w:lineRule="auto"/>
+        <w:rPr>
+          <w:rFonts w:ascii="Calibri" w:cs="Calibri" w:eastAsia="Calibri" w:hAnsi="Calibri"/>
+          <w:sz w:val="22"/>
+          <w:szCs w:val="22"/>
+        </w:rPr>
+      </w:pPr>
+      <w:r>
+        <w:rPr>
+          <w:rFonts w:ascii="Calibri" w:cs="Calibri" w:eastAsia="Calibri" w:hAnsi="Calibri"/>
+          <w:sz w:val="22"/>
+          <w:szCs w:val="22"/>
+          <w:rtl w:val="0"/>
+        </w:rPr>
+        <w:t xml:space="preserve">Responsibilities: </w:t>
       </w:r>
     </w:p>
     <w:p>
       <w:pPr>
         <w:numPr>
           <w:ilvl w:val="0"/>
-          <w:numId w:val="4"/>
+          <w:numId w:val="5"/>
         </w:numPr>
-        <w:tabs>
-          <w:tab w:val="left" w:leader="none" w:pos="1418"/>
-          <w:tab w:val="right" w:leader="none" w:pos="10503"/>
-        </w:tabs>
         <w:spacing w:after="160" w:line="259" w:lineRule="auto"/>
         <w:ind w:left="720" w:hanging="360"/>
         <w:rPr>
           <w:rFonts w:ascii="Calibri" w:cs="Calibri" w:eastAsia="Calibri" w:hAnsi="Calibri"/>
           <w:sz w:val="22"/>
           <w:szCs w:val="22"/>
-          <w:u w:val="none"/>
-        </w:rPr>
-      </w:pPr>
-      <w:r>
-        <w:rPr>
-          <w:rFonts w:ascii="Calibri" w:cs="Calibri" w:eastAsia="Calibri" w:hAnsi="Calibri"/>
-          <w:sz w:val="22"/>
-          <w:szCs w:val="22"/>
-          <w:rtl w:val="0"/>
-        </w:rPr>
-        <w:t xml:space="preserve">Delivered successful design solutions that strictly aligned with client needs and business requirements.</w:t>
-      </w:r>
-      <w:r>
-        <w:rPr>
-          <w:rtl w:val="0"/>
-        </w:rPr>
-      </w:r>
-    </w:p>
-    <w:p>
-      <w:pPr>
-        <w:tabs>
-          <w:tab w:val="left" w:leader="none" w:pos="1418"/>
-          <w:tab w:val="right" w:leader="none" w:pos="10503"/>
-        </w:tabs>
-        <w:spacing w:after="80" w:line="259" w:lineRule="auto"/>
-        <w:ind w:left="0" w:firstLine="0"/>
+        </w:rPr>
+      </w:pPr>
+      <w:r>
+        <w:rPr>
+          <w:rFonts w:ascii="Calibri" w:cs="Calibri" w:eastAsia="Calibri" w:hAnsi="Calibri"/>
+          <w:sz w:val="22"/>
+          <w:szCs w:val="22"/>
+          <w:rtl w:val="0"/>
+        </w:rPr>
+        <w:t xml:space="preserve">Led the UI/UX team in designing and delivering various projects, ensuring seamless handoff to the development team.</w:t>
+      </w:r>
+    </w:p>
+    <w:p>
+      <w:pPr>
+        <w:numPr>
+          <w:ilvl w:val="0"/>
+          <w:numId w:val="5"/>
+        </w:numPr>
+        <w:spacing w:after="160" w:line="259" w:lineRule="auto"/>
+        <w:ind w:left="720" w:hanging="360"/>
+        <w:rPr>
+          <w:rFonts w:ascii="Calibri" w:cs="Calibri" w:eastAsia="Calibri" w:hAnsi="Calibri"/>
+          <w:sz w:val="22"/>
+          <w:szCs w:val="22"/>
+        </w:rPr>
+      </w:pPr>
+      <w:r>
+        <w:rPr>
+          <w:rFonts w:ascii="Calibri" w:cs="Calibri" w:eastAsia="Calibri" w:hAnsi="Calibri"/>
+          <w:sz w:val="22"/>
+          <w:szCs w:val="22"/>
+          <w:rtl w:val="0"/>
+        </w:rPr>
+        <w:t xml:space="preserve">Established workflows and structured the company’s design team, improving team efficiency by 40%.</w:t>
+      </w:r>
+    </w:p>
+    <w:p>
+      <w:pPr>
+        <w:numPr>
+          <w:ilvl w:val="0"/>
+          <w:numId w:val="5"/>
+        </w:numPr>
+        <w:spacing w:after="160" w:line="259" w:lineRule="auto"/>
+        <w:ind w:left="720" w:hanging="360"/>
+        <w:rPr>
+          <w:rFonts w:ascii="Calibri" w:cs="Calibri" w:eastAsia="Calibri" w:hAnsi="Calibri"/>
+          <w:sz w:val="22"/>
+          <w:szCs w:val="22"/>
+        </w:rPr>
+      </w:pPr>
+      <w:r>
+        <w:rPr>
+          <w:rFonts w:ascii="Calibri" w:cs="Calibri" w:eastAsia="Calibri" w:hAnsi="Calibri"/>
+          <w:sz w:val="22"/>
+          <w:szCs w:val="22"/>
+          <w:rtl w:val="0"/>
+        </w:rPr>
+        <w:t xml:space="preserve">Developed a comprehensive design system, enhancing collaboration between designers and developers.</w:t>
+      </w:r>
+    </w:p>
+    <w:p>
+      <w:pPr>
+        <w:numPr>
+          <w:ilvl w:val="0"/>
+          <w:numId w:val="5"/>
+        </w:numPr>
+        <w:spacing w:after="160" w:line="259" w:lineRule="auto"/>
+        <w:ind w:left="720" w:hanging="360"/>
+        <w:rPr>
+          <w:rFonts w:ascii="Calibri" w:cs="Calibri" w:eastAsia="Calibri" w:hAnsi="Calibri"/>
+          <w:sz w:val="22"/>
+          <w:szCs w:val="22"/>
+        </w:rPr>
+      </w:pPr>
+      <w:r>
+        <w:rPr>
+          <w:rFonts w:ascii="Calibri" w:cs="Calibri" w:eastAsia="Calibri" w:hAnsi="Calibri"/>
+          <w:sz w:val="22"/>
+          <w:szCs w:val="22"/>
+          <w:rtl w:val="0"/>
+        </w:rPr>
+        <w:t xml:space="preserve">Presented design concepts to stakeholders, reducing decision-making time by 30%.</w:t>
+      </w:r>
+    </w:p>
+    <w:p>
+      <w:pPr>
+        <w:numPr>
+          <w:ilvl w:val="0"/>
+          <w:numId w:val="5"/>
+        </w:numPr>
+        <w:spacing w:after="160" w:line="259" w:lineRule="auto"/>
+        <w:ind w:left="720" w:hanging="360"/>
+        <w:rPr>
+          <w:rFonts w:ascii="Calibri" w:cs="Calibri" w:eastAsia="Calibri" w:hAnsi="Calibri"/>
+          <w:sz w:val="22"/>
+          <w:szCs w:val="22"/>
+        </w:rPr>
+      </w:pPr>
+      <w:r>
+        <w:rPr>
+          <w:rFonts w:ascii="Calibri" w:cs="Calibri" w:eastAsia="Calibri" w:hAnsi="Calibri"/>
+          <w:sz w:val="22"/>
+          <w:szCs w:val="22"/>
+          <w:rtl w:val="0"/>
+        </w:rPr>
+        <w:t xml:space="preserve">Delivered responsive, cross-platform designs, reducing integration issues by 15%.</w:t>
+        <w:br w:type="textWrapping"/>
+      </w:r>
+      <w:r>
+        <w:rPr>
+          <w:rtl w:val="0"/>
+        </w:rPr>
+      </w:r>
+    </w:p>
+    <w:p>
+      <w:pPr>
+        <w:spacing w:after="160" w:before="0" w:line="259" w:lineRule="auto"/>
+        <w:ind w:left="0" w:right="0" w:firstLine="0"/>
+        <w:jc w:val="left"/>
         <w:rPr>
           <w:rFonts w:ascii="Calibri" w:cs="Calibri" w:eastAsia="Calibri" w:hAnsi="Calibri"/>
           <w:b w:val="1"/>
           <w:bCs w:val="1"/>
-          <w:color w:val="2f5496"/>
-          <w:sz w:val="28"/>
-          <w:szCs w:val="28"/>
-        </w:rPr>
-      </w:pPr>
+          <w:color w:val="000000"/>
+          <w:sz w:val="22"/>
+          <w:szCs w:val="22"/>
+          <w:shd w:fill="auto" w:val="clear"/>
+          <w:vertAlign w:val="baseline"/>
+        </w:rPr>
+      </w:pPr>
+      <w:r>
+        <w:rPr>
+          <w:rFonts w:ascii="Calibri" w:cs="Calibri" w:eastAsia="Calibri" w:hAnsi="Calibri"/>
+          <w:b w:val="1"/>
+          <w:bCs w:val="1"/>
+          <w:color w:val="000000"/>
+          <w:sz w:val="22"/>
+          <w:szCs w:val="22"/>
+          <w:shd w:fill="auto" w:val="clear"/>
+          <w:vertAlign w:val="baseline"/>
+          <w:rtl w:val="0"/>
+        </w:rPr>
+        <w:t xml:space="preserve">Caspian Digital Solutions| UI/UX</w:t>
+      </w:r>
+      <w:r>
+        <w:rPr>
+          <w:rFonts w:ascii="Calibri" w:cs="Calibri" w:eastAsia="Calibri" w:hAnsi="Calibri"/>
+          <w:b w:val="1"/>
+          <w:bCs w:val="1"/>
+          <w:sz w:val="22"/>
+          <w:szCs w:val="22"/>
+          <w:rtl w:val="0"/>
+        </w:rPr>
+        <w:t xml:space="preserve"> Team Lead</w:t>
+      </w:r>
       <w:r>
         <w:rPr>
           <w:rtl w:val="0"/>
@@ -956,34 +1197,11 @@
       <w:r>
         <w:rPr>
           <w:rFonts w:ascii="Calibri" w:cs="Calibri" w:eastAsia="Calibri" w:hAnsi="Calibri"/>
-          <w:b w:val="1"/>
-          <w:bCs w:val="1"/>
-          <w:color w:val="000000"/>
-          <w:sz w:val="22"/>
-          <w:szCs w:val="22"/>
-          <w:shd w:fill="auto" w:val="clear"/>
-          <w:vertAlign w:val="baseline"/>
-          <w:rtl w:val="0"/>
-        </w:rPr>
-        <w:t xml:space="preserve">Caspian Digital Solutions| UI/UX Manager (Senior)</w:t>
-      </w:r>
-    </w:p>
-    <w:p>
-      <w:pPr>
-        <w:spacing w:after="160" w:before="0" w:line="259" w:lineRule="auto"/>
-        <w:ind w:left="0" w:right="0" w:firstLine="0"/>
-        <w:jc w:val="left"/>
-        <w:rPr>
-          <w:rFonts w:ascii="Calibri" w:cs="Calibri" w:eastAsia="Calibri" w:hAnsi="Calibri"/>
-          <w:b w:val="1"/>
-          <w:bCs w:val="1"/>
-          <w:color w:val="000000"/>
-          <w:sz w:val="22"/>
-          <w:szCs w:val="22"/>
-          <w:shd w:fill="auto" w:val="clear"/>
-          <w:vertAlign w:val="baseline"/>
-        </w:rPr>
-      </w:pPr>
+          <w:color w:val="767171"/>
+          <w:rtl w:val="0"/>
+        </w:rPr>
+        <w:t xml:space="preserve">November</w:t>
+      </w:r>
       <w:r>
         <w:rPr>
           <w:rFonts w:ascii="Calibri" w:cs="Calibri" w:eastAsia="Calibri" w:hAnsi="Calibri"/>
@@ -994,7 +1212,7 @@
           <w:vertAlign w:val="baseline"/>
           <w:rtl w:val="0"/>
         </w:rPr>
-        <w:t xml:space="preserve">September 2022 – </w:t>
+        <w:t xml:space="preserve"> 2022 – </w:t>
       </w:r>
       <w:r>
         <w:rPr>
@@ -1191,242 +1409,6 @@
           <w:rtl w:val="0"/>
         </w:rPr>
         <w:t xml:space="preserve">Implemented quarterly reviews to optimize workflows, improving team efficiency by 20%</w:t>
-        <w:br w:type="textWrapping"/>
-      </w:r>
-    </w:p>
-    <w:p>
-      <w:pPr>
-        <w:spacing w:after="160" w:before="0" w:line="259" w:lineRule="auto"/>
-        <w:ind w:left="0" w:right="0" w:firstLine="0"/>
-        <w:jc w:val="left"/>
-        <w:rPr>
-          <w:rFonts w:ascii="Calibri" w:cs="Calibri" w:eastAsia="Calibri" w:hAnsi="Calibri"/>
-          <w:color w:val="767171"/>
-          <w:sz w:val="20"/>
-          <w:szCs w:val="20"/>
-          <w:shd w:fill="auto" w:val="clear"/>
-          <w:vertAlign w:val="baseline"/>
-        </w:rPr>
-      </w:pPr>
-      <w:r>
-        <w:rPr>
-          <w:rFonts w:ascii="Calibri" w:cs="Calibri" w:eastAsia="Calibri" w:hAnsi="Calibri"/>
-          <w:b w:val="1"/>
-          <w:bCs w:val="1"/>
-          <w:color w:val="000000"/>
-          <w:sz w:val="22"/>
-          <w:szCs w:val="22"/>
-          <w:shd w:fill="auto" w:val="clear"/>
-          <w:vertAlign w:val="baseline"/>
-          <w:rtl w:val="0"/>
-        </w:rPr>
-        <w:t xml:space="preserve">Path2Live |Senior Product Designer </w:t>
-      </w:r>
-      <w:r>
-        <w:rPr>
-          <w:rFonts w:ascii="Calibri" w:cs="Calibri" w:eastAsia="Calibri" w:hAnsi="Calibri"/>
-          <w:b w:val="1"/>
-          <w:bCs w:val="1"/>
-          <w:sz w:val="22"/>
-          <w:szCs w:val="22"/>
-          <w:rtl w:val="0"/>
-        </w:rPr>
-        <w:br w:type="textWrapping"/>
-        <w:br w:type="textWrapping"/>
-      </w:r>
-      <w:r>
-        <w:rPr>
-          <w:rFonts w:ascii="Calibri" w:cs="Calibri" w:eastAsia="Calibri" w:hAnsi="Calibri"/>
-          <w:color w:val="767171"/>
-          <w:sz w:val="20"/>
-          <w:szCs w:val="20"/>
-          <w:shd w:fill="auto" w:val="clear"/>
-          <w:vertAlign w:val="baseline"/>
-          <w:rtl w:val="0"/>
-        </w:rPr>
-        <w:t xml:space="preserve">March 2024 – December 2024 | Contractor</w:t>
-      </w:r>
-    </w:p>
-    <w:p>
-      <w:pPr>
-        <w:spacing w:after="160" w:before="0" w:line="259" w:lineRule="auto"/>
-        <w:ind w:left="0" w:right="0" w:firstLine="0"/>
-        <w:jc w:val="left"/>
-        <w:rPr>
-          <w:rFonts w:ascii="Calibri" w:cs="Calibri" w:eastAsia="Calibri" w:hAnsi="Calibri"/>
-          <w:color w:val="000000"/>
-          <w:sz w:val="22"/>
-          <w:szCs w:val="22"/>
-          <w:shd w:fill="auto" w:val="clear"/>
-          <w:vertAlign w:val="baseline"/>
-        </w:rPr>
-      </w:pPr>
-      <w:r>
-        <w:rPr>
-          <w:rFonts w:ascii="Calibri" w:cs="Calibri" w:eastAsia="Calibri" w:hAnsi="Calibri"/>
-          <w:color w:val="000000"/>
-          <w:sz w:val="22"/>
-          <w:szCs w:val="22"/>
-          <w:shd w:fill="auto" w:val="clear"/>
-          <w:vertAlign w:val="baseline"/>
-          <w:rtl w:val="0"/>
-        </w:rPr>
-        <w:t xml:space="preserve">Responsibilities: </w:t>
-      </w:r>
-    </w:p>
-    <w:p>
-      <w:pPr>
-        <w:numPr>
-          <w:ilvl w:val="0"/>
-          <w:numId w:val="5"/>
-        </w:numPr>
-        <w:spacing w:after="160" w:before="0" w:line="259" w:lineRule="auto"/>
-        <w:ind w:left="720" w:right="0" w:hanging="360"/>
-        <w:jc w:val="left"/>
-        <w:rPr>
-          <w:rFonts w:ascii="Calibri" w:cs="Calibri" w:eastAsia="Calibri" w:hAnsi="Calibri"/>
-          <w:color w:val="000000"/>
-          <w:sz w:val="22"/>
-          <w:szCs w:val="22"/>
-          <w:shd w:fill="auto" w:val="clear"/>
-          <w:vertAlign w:val="baseline"/>
-        </w:rPr>
-      </w:pPr>
-      <w:r>
-        <w:rPr>
-          <w:rFonts w:ascii="Calibri" w:cs="Calibri" w:eastAsia="Calibri" w:hAnsi="Calibri"/>
-          <w:color w:val="000000"/>
-          <w:sz w:val="22"/>
-          <w:szCs w:val="22"/>
-          <w:shd w:fill="auto" w:val="clear"/>
-          <w:vertAlign w:val="baseline"/>
-          <w:rtl w:val="0"/>
-        </w:rPr>
-        <w:t xml:space="preserve">Led the UI/UX team in designing and delivering various projects, ensuring seamless handoff to the development team.</w:t>
-      </w:r>
-    </w:p>
-    <w:p>
-      <w:pPr>
-        <w:numPr>
-          <w:ilvl w:val="0"/>
-          <w:numId w:val="5"/>
-        </w:numPr>
-        <w:spacing w:after="160" w:before="0" w:line="259" w:lineRule="auto"/>
-        <w:ind w:left="720" w:right="0" w:hanging="360"/>
-        <w:jc w:val="left"/>
-        <w:rPr>
-          <w:rFonts w:ascii="Calibri" w:cs="Calibri" w:eastAsia="Calibri" w:hAnsi="Calibri"/>
-          <w:color w:val="000000"/>
-          <w:sz w:val="22"/>
-          <w:szCs w:val="22"/>
-          <w:shd w:fill="auto" w:val="clear"/>
-          <w:vertAlign w:val="baseline"/>
-        </w:rPr>
-      </w:pPr>
-      <w:r>
-        <w:rPr>
-          <w:rFonts w:ascii="Calibri" w:cs="Calibri" w:eastAsia="Calibri" w:hAnsi="Calibri"/>
-          <w:color w:val="000000"/>
-          <w:sz w:val="22"/>
-          <w:szCs w:val="22"/>
-          <w:shd w:fill="auto" w:val="clear"/>
-          <w:vertAlign w:val="baseline"/>
-          <w:rtl w:val="0"/>
-        </w:rPr>
-        <w:t xml:space="preserve">Established workflows and structured the company’s design team, improving team efficiency by 40%.</w:t>
-      </w:r>
-    </w:p>
-    <w:p>
-      <w:pPr>
-        <w:numPr>
-          <w:ilvl w:val="0"/>
-          <w:numId w:val="5"/>
-        </w:numPr>
-        <w:spacing w:after="160" w:before="0" w:line="259" w:lineRule="auto"/>
-        <w:ind w:left="720" w:right="0" w:hanging="360"/>
-        <w:jc w:val="left"/>
-        <w:rPr>
-          <w:rFonts w:ascii="Calibri" w:cs="Calibri" w:eastAsia="Calibri" w:hAnsi="Calibri"/>
-          <w:color w:val="000000"/>
-          <w:sz w:val="22"/>
-          <w:szCs w:val="22"/>
-          <w:shd w:fill="auto" w:val="clear"/>
-          <w:vertAlign w:val="baseline"/>
-        </w:rPr>
-      </w:pPr>
-      <w:r>
-        <w:rPr>
-          <w:rFonts w:ascii="Calibri" w:cs="Calibri" w:eastAsia="Calibri" w:hAnsi="Calibri"/>
-          <w:color w:val="000000"/>
-          <w:sz w:val="22"/>
-          <w:szCs w:val="22"/>
-          <w:shd w:fill="auto" w:val="clear"/>
-          <w:vertAlign w:val="baseline"/>
-          <w:rtl w:val="0"/>
-        </w:rPr>
-        <w:t xml:space="preserve">Developed a comprehensive design system, enhancing collaboration between designers and developers.</w:t>
-      </w:r>
-    </w:p>
-    <w:p>
-      <w:pPr>
-        <w:numPr>
-          <w:ilvl w:val="0"/>
-          <w:numId w:val="5"/>
-        </w:numPr>
-        <w:spacing w:after="160" w:before="0" w:line="259" w:lineRule="auto"/>
-        <w:ind w:left="720" w:right="0" w:hanging="360"/>
-        <w:jc w:val="left"/>
-        <w:rPr>
-          <w:rFonts w:ascii="Calibri" w:cs="Calibri" w:eastAsia="Calibri" w:hAnsi="Calibri"/>
-          <w:color w:val="000000"/>
-          <w:sz w:val="22"/>
-          <w:szCs w:val="22"/>
-          <w:shd w:fill="auto" w:val="clear"/>
-          <w:vertAlign w:val="baseline"/>
-        </w:rPr>
-      </w:pPr>
-      <w:r>
-        <w:rPr>
-          <w:rFonts w:ascii="Calibri" w:cs="Calibri" w:eastAsia="Calibri" w:hAnsi="Calibri"/>
-          <w:color w:val="000000"/>
-          <w:sz w:val="22"/>
-          <w:szCs w:val="22"/>
-          <w:shd w:fill="auto" w:val="clear"/>
-          <w:vertAlign w:val="baseline"/>
-          <w:rtl w:val="0"/>
-        </w:rPr>
-        <w:t xml:space="preserve">Presented design concepts to stakeholders, reducing decision-making time by 30%.</w:t>
-      </w:r>
-    </w:p>
-    <w:p>
-      <w:pPr>
-        <w:numPr>
-          <w:ilvl w:val="0"/>
-          <w:numId w:val="5"/>
-        </w:numPr>
-        <w:spacing w:after="160" w:before="0" w:line="259" w:lineRule="auto"/>
-        <w:ind w:left="720" w:right="0" w:hanging="360"/>
-        <w:jc w:val="left"/>
-        <w:rPr>
-          <w:rFonts w:ascii="Calibri" w:cs="Calibri" w:eastAsia="Calibri" w:hAnsi="Calibri"/>
-          <w:color w:val="000000"/>
-          <w:sz w:val="22"/>
-          <w:szCs w:val="22"/>
-          <w:shd w:fill="auto" w:val="clear"/>
-          <w:vertAlign w:val="baseline"/>
-        </w:rPr>
-      </w:pPr>
-      <w:r>
-        <w:rPr>
-          <w:rFonts w:ascii="Calibri" w:cs="Calibri" w:eastAsia="Calibri" w:hAnsi="Calibri"/>
-          <w:color w:val="000000"/>
-          <w:sz w:val="22"/>
-          <w:szCs w:val="22"/>
-          <w:shd w:fill="auto" w:val="clear"/>
-          <w:vertAlign w:val="baseline"/>
-          <w:rtl w:val="0"/>
-        </w:rPr>
-        <w:t xml:space="preserve">Delivered responsive, cross-platform designs, reducing integration issues by 15%.</w:t>
       </w:r>
     </w:p>
     <w:p>
@@ -1909,7 +1891,7 @@
           <w:vertAlign w:val="baseline"/>
           <w:rtl w:val="0"/>
         </w:rPr>
-        <w:t xml:space="preserve">VOIS_  (Vodafone </w:t>
+        <w:t xml:space="preserve">VOIS  (Vodafone </w:t>
       </w:r>
       <w:r>
         <w:rPr>
@@ -2733,7 +2715,7 @@
         </w:rPr>
         <w:t xml:space="preserve">Available at </w:t>
       </w:r>
-      <w:hyperlink r:id="rId8">
+      <w:hyperlink r:id="rId9">
         <w:r>
           <w:rPr>
             <w:rFonts w:ascii="Calibri" w:cs="Calibri" w:eastAsia="Calibri" w:hAnsi="Calibri"/>

</xml_diff>

<commit_message>
Update resume PDF and DOCX assets.
</commit_message>
<xml_diff>
--- a/assets/Hassan-Amin-CV-Resume.docx
+++ b/assets/Hassan-Amin-CV-Resume.docx
@@ -74,7 +74,7 @@
         <w:jc w:val="left"/>
         <w:rPr>
           <w:rFonts w:ascii="Calibri" w:cs="Calibri" w:eastAsia="Calibri" w:hAnsi="Calibri"/>
-          <w:color w:val="000000"/>
+          <w:color w:val="0000ff"/>
           <w:sz w:val="20"/>
           <w:szCs w:val="20"/>
           <w:shd w:fill="auto" w:val="clear"/>
@@ -84,6 +84,13 @@
       <w:r>
         <w:rPr>
           <w:rFonts w:ascii="Calibri" w:cs="Calibri" w:eastAsia="Calibri" w:hAnsi="Calibri"/>
+          <w:rtl w:val="0"/>
+        </w:rPr>
+        <w:t xml:space="preserve">EMEA - </w:t>
+      </w:r>
+      <w:r>
+        <w:rPr>
+          <w:rFonts w:ascii="Calibri" w:cs="Calibri" w:eastAsia="Calibri" w:hAnsi="Calibri"/>
           <w:color w:val="000000"/>
           <w:sz w:val="20"/>
           <w:szCs w:val="20"/>
@@ -112,15 +119,18 @@
         </w:rPr>
         <w:t xml:space="preserve">|</w:t>
       </w:r>
-      <w:r>
-        <w:rPr>
-          <w:rFonts w:ascii="Calibri" w:cs="Calibri" w:eastAsia="Calibri" w:hAnsi="Calibri"/>
-          <w:color w:val="0000ff"/>
-          <w:rtl w:val="0"/>
-        </w:rPr>
-        <w:t xml:space="preserve"> </w:t>
-      </w:r>
-      <w:hyperlink r:id="rId6">
+      <w:hyperlink r:id="rId7">
+        <w:r>
+          <w:rPr>
+            <w:rFonts w:ascii="Calibri" w:cs="Calibri" w:eastAsia="Calibri" w:hAnsi="Calibri"/>
+            <w:color w:val="0000ff"/>
+            <w:u w:val="single"/>
+            <w:rtl w:val="0"/>
+          </w:rPr>
+          <w:t xml:space="preserve"> contact.</w:t>
+        </w:r>
+      </w:hyperlink>
+      <w:hyperlink r:id="rId8">
         <w:r>
           <w:rPr>
             <w:rFonts w:ascii="Calibri" w:cs="Calibri" w:eastAsia="Calibri" w:hAnsi="Calibri"/>
@@ -132,21 +142,24 @@
             <w:vertAlign w:val="baseline"/>
             <w:rtl w:val="0"/>
           </w:rPr>
-          <w:t xml:space="preserve">hassan.amin.elsayed@gmail.com</w:t>
+          <w:t xml:space="preserve">hassan.amin@gmail.com</w:t>
         </w:r>
       </w:hyperlink>
+      <w:hyperlink r:id="rId9">
+        <w:r>
+          <w:rPr>
+            <w:rFonts w:ascii="Calibri" w:cs="Calibri" w:eastAsia="Calibri" w:hAnsi="Calibri"/>
+            <w:color w:val="0000ff"/>
+            <w:u w:val="single"/>
+            <w:rtl w:val="0"/>
+          </w:rPr>
+          <w:t xml:space="preserve"> </w:t>
+        </w:r>
+      </w:hyperlink>
       <w:r>
         <w:rPr>
           <w:rFonts w:ascii="Calibri" w:cs="Calibri" w:eastAsia="Calibri" w:hAnsi="Calibri"/>
           <w:color w:val="0000ff"/>
-          <w:rtl w:val="0"/>
-        </w:rPr>
-        <w:t xml:space="preserve"> </w:t>
-      </w:r>
-      <w:r>
-        <w:rPr>
-          <w:rFonts w:ascii="Calibri" w:cs="Calibri" w:eastAsia="Calibri" w:hAnsi="Calibri"/>
-          <w:color w:val="000000"/>
           <w:sz w:val="20"/>
           <w:szCs w:val="20"/>
           <w:shd w:fill="auto" w:val="clear"/>
@@ -155,7 +168,7 @@
         </w:rPr>
         <w:t xml:space="preserve">| </w:t>
       </w:r>
-      <w:hyperlink r:id="rId7">
+      <w:hyperlink r:id="rId10">
         <w:r>
           <w:rPr>
             <w:rFonts w:ascii="Calibri" w:cs="Calibri" w:eastAsia="Calibri" w:hAnsi="Calibri"/>
@@ -173,7 +186,7 @@
       <w:r>
         <w:rPr>
           <w:rFonts w:ascii="Calibri" w:cs="Calibri" w:eastAsia="Calibri" w:hAnsi="Calibri"/>
-          <w:color w:val="000000"/>
+          <w:color w:val="0000ff"/>
           <w:sz w:val="20"/>
           <w:szCs w:val="20"/>
           <w:shd w:fill="auto" w:val="clear"/>
@@ -185,11 +198,12 @@
       <w:r>
         <w:rPr>
           <w:rFonts w:ascii="Calibri" w:cs="Calibri" w:eastAsia="Calibri" w:hAnsi="Calibri"/>
+          <w:color w:val="0000ff"/>
           <w:rtl w:val="0"/>
         </w:rPr>
         <w:t xml:space="preserve"> </w:t>
       </w:r>
-      <w:hyperlink r:id="rId8">
+      <w:hyperlink r:id="rId11">
         <w:r>
           <w:rPr>
             <w:rFonts w:ascii="Calibri" w:cs="Calibri" w:eastAsia="Calibri" w:hAnsi="Calibri"/>
@@ -678,7 +692,7 @@
       <w:pPr>
         <w:numPr>
           <w:ilvl w:val="0"/>
-          <w:numId w:val="4"/>
+          <w:numId w:val="5"/>
         </w:numPr>
         <w:tabs>
           <w:tab w:val="left" w:leader="none" w:pos="1418"/>
@@ -702,12 +716,17 @@
         </w:rPr>
         <w:t xml:space="preserve">Spearhead the end-to-end design of intuitive, high-fidelity interfaces, prioritizing data clarity, WCAG accessibility, and localization for enterprise construction management tools.</w:t>
       </w:r>
+      <w:r>
+        <w:rPr>
+          <w:rtl w:val="0"/>
+        </w:rPr>
+      </w:r>
     </w:p>
     <w:p>
       <w:pPr>
         <w:numPr>
           <w:ilvl w:val="0"/>
-          <w:numId w:val="4"/>
+          <w:numId w:val="5"/>
         </w:numPr>
         <w:tabs>
           <w:tab w:val="left" w:leader="none" w:pos="1418"/>
@@ -731,12 +750,17 @@
         </w:rPr>
         <w:t xml:space="preserve">Accelerate design-to-development workflows by leveraging AI tools (Claude, Cursor, NotebookLM) to build seamless prototypes and assist in foundational coding.</w:t>
       </w:r>
+      <w:r>
+        <w:rPr>
+          <w:rtl w:val="0"/>
+        </w:rPr>
+      </w:r>
     </w:p>
     <w:p>
       <w:pPr>
         <w:numPr>
           <w:ilvl w:val="0"/>
-          <w:numId w:val="4"/>
+          <w:numId w:val="5"/>
         </w:numPr>
         <w:tabs>
           <w:tab w:val="left" w:leader="none" w:pos="1418"/>
@@ -760,12 +784,17 @@
         </w:rPr>
         <w:t xml:space="preserve">Partner with UX researchers to conduct generative studies and usability tests, utilizing data-driven insights to refine solutions prior to production release.</w:t>
       </w:r>
+      <w:r>
+        <w:rPr>
+          <w:rtl w:val="0"/>
+        </w:rPr>
+      </w:r>
     </w:p>
     <w:p>
       <w:pPr>
         <w:numPr>
           <w:ilvl w:val="0"/>
-          <w:numId w:val="4"/>
+          <w:numId w:val="5"/>
         </w:numPr>
         <w:tabs>
           <w:tab w:val="left" w:leader="none" w:pos="1418"/>
@@ -789,6 +818,11 @@
         </w:rPr>
         <w:t xml:space="preserve">Contribute scalable, reusable components to the global shared Design System, ensuring UI consistency across multiple product modules.</w:t>
       </w:r>
+      <w:r>
+        <w:rPr>
+          <w:rtl w:val="0"/>
+        </w:rPr>
+      </w:r>
     </w:p>
     <w:p>
       <w:pPr>
@@ -857,7 +891,7 @@
       <w:pPr>
         <w:numPr>
           <w:ilvl w:val="0"/>
-          <w:numId w:val="4"/>
+          <w:numId w:val="5"/>
         </w:numPr>
         <w:tabs>
           <w:tab w:val="left" w:leader="none" w:pos="1418"/>
@@ -891,7 +925,7 @@
       <w:pPr>
         <w:numPr>
           <w:ilvl w:val="0"/>
-          <w:numId w:val="4"/>
+          <w:numId w:val="5"/>
         </w:numPr>
         <w:tabs>
           <w:tab w:val="left" w:leader="none" w:pos="1418"/>
@@ -925,7 +959,7 @@
       <w:pPr>
         <w:numPr>
           <w:ilvl w:val="0"/>
-          <w:numId w:val="4"/>
+          <w:numId w:val="5"/>
         </w:numPr>
         <w:tabs>
           <w:tab w:val="left" w:leader="none" w:pos="1418"/>
@@ -983,7 +1017,7 @@
           <w:color w:val="767171"/>
           <w:rtl w:val="0"/>
         </w:rPr>
-        <w:t xml:space="preserve">March 2024 – December 2024 | Parti-time</w:t>
+        <w:t xml:space="preserve">March 2024 – December 2024 | Part-time</w:t>
       </w:r>
     </w:p>
     <w:p>
@@ -1009,7 +1043,7 @@
       <w:pPr>
         <w:numPr>
           <w:ilvl w:val="0"/>
-          <w:numId w:val="5"/>
+          <w:numId w:val="6"/>
         </w:numPr>
         <w:spacing w:after="160" w:line="259" w:lineRule="auto"/>
         <w:ind w:left="720" w:hanging="360"/>
@@ -1033,7 +1067,7 @@
       <w:pPr>
         <w:numPr>
           <w:ilvl w:val="0"/>
-          <w:numId w:val="5"/>
+          <w:numId w:val="6"/>
         </w:numPr>
         <w:spacing w:after="160" w:line="259" w:lineRule="auto"/>
         <w:ind w:left="720" w:hanging="360"/>
@@ -1057,7 +1091,7 @@
       <w:pPr>
         <w:numPr>
           <w:ilvl w:val="0"/>
-          <w:numId w:val="5"/>
+          <w:numId w:val="6"/>
         </w:numPr>
         <w:spacing w:after="160" w:line="259" w:lineRule="auto"/>
         <w:ind w:left="720" w:hanging="360"/>
@@ -1081,7 +1115,7 @@
       <w:pPr>
         <w:numPr>
           <w:ilvl w:val="0"/>
-          <w:numId w:val="5"/>
+          <w:numId w:val="6"/>
         </w:numPr>
         <w:spacing w:after="160" w:line="259" w:lineRule="auto"/>
         <w:ind w:left="720" w:hanging="360"/>
@@ -1105,7 +1139,7 @@
       <w:pPr>
         <w:numPr>
           <w:ilvl w:val="0"/>
-          <w:numId w:val="5"/>
+          <w:numId w:val="6"/>
         </w:numPr>
         <w:spacing w:after="160" w:line="259" w:lineRule="auto"/>
         <w:ind w:left="720" w:hanging="360"/>
@@ -1124,11 +1158,6 @@
         </w:rPr>
         <w:t xml:space="preserve">Delivered responsive, cross-platform designs, reducing integration issues by 15%.</w:t>
         <w:br w:type="textWrapping"/>
-      </w:r>
-      <w:r>
-        <w:rPr>
-          <w:rtl w:val="0"/>
-        </w:rPr>
       </w:r>
     </w:p>
     <w:p>
@@ -1275,7 +1304,7 @@
       <w:pPr>
         <w:numPr>
           <w:ilvl w:val="0"/>
-          <w:numId w:val="4"/>
+          <w:numId w:val="5"/>
         </w:numPr>
         <w:tabs>
           <w:tab w:val="left" w:leader="none" w:pos="1418"/>
@@ -1310,7 +1339,7 @@
       <w:pPr>
         <w:numPr>
           <w:ilvl w:val="0"/>
-          <w:numId w:val="4"/>
+          <w:numId w:val="5"/>
         </w:numPr>
         <w:tabs>
           <w:tab w:val="left" w:leader="none" w:pos="1418"/>
@@ -1345,7 +1374,7 @@
       <w:pPr>
         <w:numPr>
           <w:ilvl w:val="0"/>
-          <w:numId w:val="4"/>
+          <w:numId w:val="5"/>
         </w:numPr>
         <w:tabs>
           <w:tab w:val="left" w:leader="none" w:pos="1418"/>
@@ -1380,7 +1409,7 @@
       <w:pPr>
         <w:numPr>
           <w:ilvl w:val="0"/>
-          <w:numId w:val="4"/>
+          <w:numId w:val="5"/>
         </w:numPr>
         <w:tabs>
           <w:tab w:val="left" w:leader="none" w:pos="1418"/>
@@ -1506,220 +1535,6 @@
           <w:tab w:val="left" w:leader="none" w:pos="1418"/>
           <w:tab w:val="right" w:leader="none" w:pos="10503"/>
         </w:tabs>
-        <w:spacing w:after="80" w:before="0" w:line="259" w:lineRule="auto"/>
-        <w:ind w:left="0" w:right="0" w:firstLine="0"/>
-        <w:jc w:val="left"/>
-        <w:rPr>
-          <w:rFonts w:ascii="Calibri" w:cs="Calibri" w:eastAsia="Calibri" w:hAnsi="Calibri"/>
-          <w:color w:val="000000"/>
-          <w:sz w:val="22"/>
-          <w:szCs w:val="22"/>
-          <w:shd w:fill="auto" w:val="clear"/>
-          <w:vertAlign w:val="baseline"/>
-        </w:rPr>
-      </w:pPr>
-      <w:r>
-        <w:rPr>
-          <w:rFonts w:ascii="Calibri" w:cs="Calibri" w:eastAsia="Calibri" w:hAnsi="Calibri"/>
-          <w:color w:val="000000"/>
-          <w:sz w:val="22"/>
-          <w:szCs w:val="22"/>
-          <w:shd w:fill="auto" w:val="clear"/>
-          <w:vertAlign w:val="baseline"/>
-          <w:rtl w:val="0"/>
-        </w:rPr>
-        <w:t xml:space="preserve">Responsibilities:</w:t>
-      </w:r>
-    </w:p>
-    <w:p>
-      <w:pPr>
-        <w:numPr>
-          <w:ilvl w:val="0"/>
-          <w:numId w:val="6"/>
-        </w:numPr>
-        <w:tabs>
-          <w:tab w:val="left" w:leader="none" w:pos="1418"/>
-          <w:tab w:val="right" w:leader="none" w:pos="10503"/>
-        </w:tabs>
-        <w:spacing w:after="160" w:before="0" w:line="259" w:lineRule="auto"/>
-        <w:ind w:left="720" w:right="0" w:hanging="360"/>
-        <w:jc w:val="left"/>
-        <w:rPr>
-          <w:rFonts w:ascii="Calibri" w:cs="Calibri" w:eastAsia="Calibri" w:hAnsi="Calibri"/>
-          <w:color w:val="000000"/>
-          <w:sz w:val="22"/>
-          <w:szCs w:val="22"/>
-          <w:shd w:fill="auto" w:val="clear"/>
-          <w:vertAlign w:val="baseline"/>
-        </w:rPr>
-      </w:pPr>
-      <w:r>
-        <w:rPr>
-          <w:rFonts w:ascii="Calibri" w:cs="Calibri" w:eastAsia="Calibri" w:hAnsi="Calibri"/>
-          <w:color w:val="000000"/>
-          <w:sz w:val="22"/>
-          <w:szCs w:val="22"/>
-          <w:shd w:fill="auto" w:val="clear"/>
-          <w:vertAlign w:val="baseline"/>
-          <w:rtl w:val="0"/>
-        </w:rPr>
-        <w:t xml:space="preserve">Created detailed wireframes and user flows, improving cross-team clarity by 20%.</w:t>
-      </w:r>
-    </w:p>
-    <w:p>
-      <w:pPr>
-        <w:numPr>
-          <w:ilvl w:val="0"/>
-          <w:numId w:val="6"/>
-        </w:numPr>
-        <w:tabs>
-          <w:tab w:val="left" w:leader="none" w:pos="1418"/>
-          <w:tab w:val="right" w:leader="none" w:pos="10503"/>
-        </w:tabs>
-        <w:spacing w:after="160" w:before="0" w:line="259" w:lineRule="auto"/>
-        <w:ind w:left="720" w:right="0" w:hanging="360"/>
-        <w:jc w:val="left"/>
-        <w:rPr>
-          <w:rFonts w:ascii="Calibri" w:cs="Calibri" w:eastAsia="Calibri" w:hAnsi="Calibri"/>
-          <w:color w:val="000000"/>
-          <w:sz w:val="22"/>
-          <w:szCs w:val="22"/>
-          <w:shd w:fill="auto" w:val="clear"/>
-          <w:vertAlign w:val="baseline"/>
-        </w:rPr>
-      </w:pPr>
-      <w:r>
-        <w:rPr>
-          <w:rFonts w:ascii="Calibri" w:cs="Calibri" w:eastAsia="Calibri" w:hAnsi="Calibri"/>
-          <w:color w:val="000000"/>
-          <w:sz w:val="22"/>
-          <w:szCs w:val="22"/>
-          <w:shd w:fill="auto" w:val="clear"/>
-          <w:vertAlign w:val="baseline"/>
-          <w:rtl w:val="0"/>
-        </w:rPr>
-        <w:t xml:space="preserve">Established design guidelines, enhancing brand consistency and reducing iteration time by 25%.</w:t>
-      </w:r>
-    </w:p>
-    <w:p>
-      <w:pPr>
-        <w:numPr>
-          <w:ilvl w:val="0"/>
-          <w:numId w:val="6"/>
-        </w:numPr>
-        <w:tabs>
-          <w:tab w:val="left" w:leader="none" w:pos="1418"/>
-          <w:tab w:val="right" w:leader="none" w:pos="10503"/>
-        </w:tabs>
-        <w:spacing w:after="160" w:before="0" w:line="259" w:lineRule="auto"/>
-        <w:ind w:left="720" w:right="0" w:hanging="360"/>
-        <w:jc w:val="left"/>
-        <w:rPr>
-          <w:rFonts w:ascii="Calibri" w:cs="Calibri" w:eastAsia="Calibri" w:hAnsi="Calibri"/>
-          <w:color w:val="000000"/>
-          <w:sz w:val="22"/>
-          <w:szCs w:val="22"/>
-          <w:shd w:fill="auto" w:val="clear"/>
-          <w:vertAlign w:val="baseline"/>
-        </w:rPr>
-      </w:pPr>
-      <w:r>
-        <w:rPr>
-          <w:rFonts w:ascii="Calibri" w:cs="Calibri" w:eastAsia="Calibri" w:hAnsi="Calibri"/>
-          <w:color w:val="000000"/>
-          <w:sz w:val="22"/>
-          <w:szCs w:val="22"/>
-          <w:shd w:fill="auto" w:val="clear"/>
-          <w:vertAlign w:val="baseline"/>
-          <w:rtl w:val="0"/>
-        </w:rPr>
-        <w:t xml:space="preserve">Presented and defended designs, achieving a 90% approval rate in the first round.</w:t>
-      </w:r>
-    </w:p>
-    <w:p>
-      <w:pPr>
-        <w:tabs>
-          <w:tab w:val="left" w:leader="none" w:pos="1418"/>
-          <w:tab w:val="right" w:leader="none" w:pos="10503"/>
-        </w:tabs>
-        <w:spacing w:after="160" w:before="0" w:line="259" w:lineRule="auto"/>
-        <w:ind w:left="0" w:right="0" w:firstLine="0"/>
-        <w:jc w:val="left"/>
-        <w:rPr>
-          <w:rFonts w:ascii="Calibri" w:cs="Calibri" w:eastAsia="Calibri" w:hAnsi="Calibri"/>
-          <w:color w:val="000000"/>
-          <w:sz w:val="22"/>
-          <w:szCs w:val="22"/>
-          <w:shd w:fill="auto" w:val="clear"/>
-          <w:vertAlign w:val="baseline"/>
-        </w:rPr>
-      </w:pPr>
-      <w:r>
-        <w:rPr>
-          <w:rtl w:val="0"/>
-        </w:rPr>
-      </w:r>
-    </w:p>
-    <w:p>
-      <w:pPr>
-        <w:spacing w:after="80" w:before="0" w:line="259" w:lineRule="auto"/>
-        <w:ind w:left="0" w:right="0" w:firstLine="0"/>
-        <w:jc w:val="left"/>
-        <w:rPr>
-          <w:rFonts w:ascii="Calibri" w:cs="Calibri" w:eastAsia="Calibri" w:hAnsi="Calibri"/>
-          <w:b w:val="1"/>
-          <w:bCs w:val="1"/>
-          <w:color w:val="000000"/>
-          <w:sz w:val="22"/>
-          <w:szCs w:val="22"/>
-          <w:shd w:fill="auto" w:val="clear"/>
-          <w:vertAlign w:val="baseline"/>
-        </w:rPr>
-      </w:pPr>
-      <w:r>
-        <w:rPr>
-          <w:rFonts w:ascii="Calibri" w:cs="Calibri" w:eastAsia="Calibri" w:hAnsi="Calibri"/>
-          <w:b w:val="1"/>
-          <w:bCs w:val="1"/>
-          <w:color w:val="000000"/>
-          <w:sz w:val="22"/>
-          <w:szCs w:val="22"/>
-          <w:shd w:fill="auto" w:val="clear"/>
-          <w:vertAlign w:val="baseline"/>
-          <w:rtl w:val="0"/>
-        </w:rPr>
-        <w:t xml:space="preserve">Spiritude | UI/UX Designer /  Product Designer </w:t>
-      </w:r>
-    </w:p>
-    <w:p>
-      <w:pPr>
-        <w:spacing w:after="80" w:before="0" w:line="259" w:lineRule="auto"/>
-        <w:ind w:left="0" w:right="0" w:firstLine="0"/>
-        <w:jc w:val="left"/>
-        <w:rPr>
-          <w:rFonts w:ascii="Calibri" w:cs="Calibri" w:eastAsia="Calibri" w:hAnsi="Calibri"/>
-          <w:color w:val="767171"/>
-          <w:sz w:val="20"/>
-          <w:szCs w:val="20"/>
-          <w:shd w:fill="auto" w:val="clear"/>
-          <w:vertAlign w:val="baseline"/>
-        </w:rPr>
-      </w:pPr>
-      <w:r>
-        <w:rPr>
-          <w:rFonts w:ascii="Calibri" w:cs="Calibri" w:eastAsia="Calibri" w:hAnsi="Calibri"/>
-          <w:color w:val="767171"/>
-          <w:sz w:val="20"/>
-          <w:szCs w:val="20"/>
-          <w:shd w:fill="auto" w:val="clear"/>
-          <w:vertAlign w:val="baseline"/>
-          <w:rtl w:val="0"/>
-        </w:rPr>
-        <w:t xml:space="preserve">December 2021 – May 2022| Full-Time</w:t>
-      </w:r>
-    </w:p>
-    <w:p>
-      <w:pPr>
         <w:spacing w:after="80" w:before="0" w:line="259" w:lineRule="auto"/>
         <w:ind w:left="0" w:right="0" w:firstLine="0"/>
         <w:jc w:val="left"/>
@@ -1777,7 +1592,7 @@
           <w:vertAlign w:val="baseline"/>
           <w:rtl w:val="0"/>
         </w:rPr>
-        <w:t xml:space="preserve">Conducted user research and competitor analysis, driving a 20% improvement in product positioning.</w:t>
+        <w:t xml:space="preserve">Created detailed wireframes and user flows, improving cross-team clarity by 20%.</w:t>
       </w:r>
     </w:p>
     <w:p>
@@ -1812,7 +1627,7 @@
           <w:vertAlign w:val="baseline"/>
           <w:rtl w:val="0"/>
         </w:rPr>
-        <w:t xml:space="preserve">Created user personas and usage scenarios, increasing feature adoption by 30%.</w:t>
+        <w:t xml:space="preserve">Established design guidelines, enhancing brand consistency and reducing iteration time by 25%.</w:t>
       </w:r>
     </w:p>
     <w:p>
@@ -1847,7 +1662,31 @@
           <w:vertAlign w:val="baseline"/>
           <w:rtl w:val="0"/>
         </w:rPr>
-        <w:t xml:space="preserve">Delivered cohesive design systems, reducing inconsistencies by 40%.</w:t>
+        <w:t xml:space="preserve">Presented and defended designs, achieving a 90% approval rate in the first round.</w:t>
+      </w:r>
+    </w:p>
+    <w:p>
+      <w:pPr>
+        <w:tabs>
+          <w:tab w:val="left" w:leader="none" w:pos="1418"/>
+          <w:tab w:val="right" w:leader="none" w:pos="10503"/>
+        </w:tabs>
+        <w:spacing w:after="160" w:before="0" w:line="259" w:lineRule="auto"/>
+        <w:ind w:left="0" w:right="0" w:firstLine="0"/>
+        <w:jc w:val="left"/>
+        <w:rPr>
+          <w:rFonts w:ascii="Calibri" w:cs="Calibri" w:eastAsia="Calibri" w:hAnsi="Calibri"/>
+          <w:color w:val="000000"/>
+          <w:sz w:val="22"/>
+          <w:szCs w:val="22"/>
+          <w:shd w:fill="auto" w:val="clear"/>
+          <w:vertAlign w:val="baseline"/>
+        </w:rPr>
+      </w:pPr>
+      <w:r>
+        <w:rPr>
+          <w:rtl w:val="0"/>
+        </w:rPr>
       </w:r>
     </w:p>
     <w:p>
@@ -1869,19 +1708,6 @@
       <w:r>
         <w:rPr>
           <w:rFonts w:ascii="Calibri" w:cs="Calibri" w:eastAsia="Calibri" w:hAnsi="Calibri"/>
-          <w:color w:val="000000"/>
-          <w:sz w:val="22"/>
-          <w:szCs w:val="22"/>
-          <w:shd w:fill="auto" w:val="clear"/>
-          <w:vertAlign w:val="baseline"/>
-          <w:rtl w:val="0"/>
-        </w:rPr>
-        <w:br w:type="textWrapping"/>
-        <w:br w:type="textWrapping"/>
-      </w:r>
-      <w:r>
-        <w:rPr>
-          <w:rFonts w:ascii="Calibri" w:cs="Calibri" w:eastAsia="Calibri" w:hAnsi="Calibri"/>
           <w:b w:val="1"/>
           <w:bCs w:val="1"/>
           <w:color w:val="000000"/>
@@ -1891,32 +1717,7 @@
           <w:vertAlign w:val="baseline"/>
           <w:rtl w:val="0"/>
         </w:rPr>
-        <w:t xml:space="preserve">VOIS  (Vodafone </w:t>
-      </w:r>
-      <w:r>
-        <w:rPr>
-          <w:rFonts w:ascii="Calibri" w:cs="Calibri" w:eastAsia="Calibri" w:hAnsi="Calibri"/>
-          <w:b w:val="1"/>
-          <w:bCs w:val="1"/>
-          <w:sz w:val="22"/>
-          <w:szCs w:val="22"/>
-          <w:rtl w:val="0"/>
-        </w:rPr>
-        <w:t xml:space="preserve">Intelligent</w:t>
-      </w:r>
-      <w:r>
-        <w:rPr>
-          <w:rFonts w:ascii="Calibri" w:cs="Calibri" w:eastAsia="Calibri" w:hAnsi="Calibri"/>
-          <w:b w:val="1"/>
-          <w:bCs w:val="1"/>
-          <w:color w:val="000000"/>
-          <w:sz w:val="22"/>
-          <w:szCs w:val="22"/>
-          <w:shd w:fill="auto" w:val="clear"/>
-          <w:vertAlign w:val="baseline"/>
-          <w:rtl w:val="0"/>
-        </w:rPr>
-        <w:t xml:space="preserve"> Solutions)| UK Account Advisor/Subject Matter Expert</w:t>
+        <w:t xml:space="preserve">Spiritude | UI/UX Designer /  Product Designer </w:t>
       </w:r>
     </w:p>
     <w:p>
@@ -1943,7 +1744,7 @@
           <w:vertAlign w:val="baseline"/>
           <w:rtl w:val="0"/>
         </w:rPr>
-        <w:t xml:space="preserve">Mar 2018 – Mar 2021| Full-Time</w:t>
+        <w:t xml:space="preserve">December 2021 – May 2022| Full-Time</w:t>
       </w:r>
     </w:p>
     <w:p>
@@ -2005,7 +1806,7 @@
           <w:vertAlign w:val="baseline"/>
           <w:rtl w:val="0"/>
         </w:rPr>
-        <w:t xml:space="preserve">Documented workflows and identified optimization opportunities, improving team productivity.</w:t>
+        <w:t xml:space="preserve">Conducted user research and competitor analysis, driving a 20% improvement in product positioning.</w:t>
       </w:r>
     </w:p>
     <w:p>
@@ -2040,63 +1841,165 @@
           <w:vertAlign w:val="baseline"/>
           <w:rtl w:val="0"/>
         </w:rPr>
-        <w:t xml:space="preserve">Led the SME team towards improving the Customer Experience Cycle (CXX).</w:t>
-      </w:r>
-    </w:p>
-    <w:p>
-      <w:pPr>
+        <w:t xml:space="preserve">Created user personas and usage scenarios, increasing feature adoption by 30%.</w:t>
+      </w:r>
+    </w:p>
+    <w:p>
+      <w:pPr>
+        <w:numPr>
+          <w:ilvl w:val="0"/>
+          <w:numId w:val="8"/>
+        </w:numPr>
         <w:tabs>
           <w:tab w:val="left" w:leader="none" w:pos="1418"/>
           <w:tab w:val="right" w:leader="none" w:pos="10503"/>
         </w:tabs>
         <w:spacing w:after="160" w:before="0" w:line="259" w:lineRule="auto"/>
-        <w:ind w:left="0" w:right="0" w:firstLine="0"/>
-        <w:jc w:val="left"/>
-        <w:rPr>
-          <w:rFonts w:ascii="Calibri" w:cs="Calibri" w:eastAsia="Calibri" w:hAnsi="Calibri"/>
-          <w:color w:val="000000"/>
-          <w:sz w:val="22"/>
-          <w:szCs w:val="22"/>
-          <w:shd w:fill="auto" w:val="clear"/>
-          <w:vertAlign w:val="baseline"/>
-        </w:rPr>
-      </w:pPr>
-      <w:r>
-        <w:rPr>
-          <w:rtl w:val="0"/>
-        </w:rPr>
-      </w:r>
-    </w:p>
-    <w:p>
-      <w:pPr>
-        <w:spacing w:after="160" w:before="0" w:line="259" w:lineRule="auto"/>
+        <w:ind w:left="720" w:right="0" w:hanging="360"/>
+        <w:jc w:val="left"/>
+        <w:rPr>
+          <w:rFonts w:ascii="Calibri" w:cs="Calibri" w:eastAsia="Calibri" w:hAnsi="Calibri"/>
+          <w:color w:val="000000"/>
+          <w:sz w:val="22"/>
+          <w:szCs w:val="22"/>
+          <w:shd w:fill="auto" w:val="clear"/>
+          <w:vertAlign w:val="baseline"/>
+        </w:rPr>
+      </w:pPr>
+      <w:r>
+        <w:rPr>
+          <w:rFonts w:ascii="Calibri" w:cs="Calibri" w:eastAsia="Calibri" w:hAnsi="Calibri"/>
+          <w:color w:val="000000"/>
+          <w:sz w:val="22"/>
+          <w:szCs w:val="22"/>
+          <w:shd w:fill="auto" w:val="clear"/>
+          <w:vertAlign w:val="baseline"/>
+          <w:rtl w:val="0"/>
+        </w:rPr>
+        <w:t xml:space="preserve">Delivered cohesive design systems, reducing inconsistencies by 40%.</w:t>
+      </w:r>
+    </w:p>
+    <w:p>
+      <w:pPr>
+        <w:spacing w:after="80" w:before="0" w:line="259" w:lineRule="auto"/>
         <w:ind w:left="0" w:right="0" w:firstLine="0"/>
         <w:jc w:val="left"/>
         <w:rPr>
           <w:rFonts w:ascii="Calibri" w:cs="Calibri" w:eastAsia="Calibri" w:hAnsi="Calibri"/>
           <w:b w:val="1"/>
           <w:bCs w:val="1"/>
-          <w:color w:val="2f5496"/>
-          <w:sz w:val="28"/>
-          <w:szCs w:val="28"/>
-          <w:shd w:fill="auto" w:val="clear"/>
-          <w:vertAlign w:val="baseline"/>
-        </w:rPr>
-      </w:pPr>
+          <w:color w:val="000000"/>
+          <w:sz w:val="22"/>
+          <w:szCs w:val="22"/>
+          <w:shd w:fill="auto" w:val="clear"/>
+          <w:vertAlign w:val="baseline"/>
+        </w:rPr>
+      </w:pPr>
+      <w:r>
+        <w:rPr>
+          <w:rFonts w:ascii="Calibri" w:cs="Calibri" w:eastAsia="Calibri" w:hAnsi="Calibri"/>
+          <w:color w:val="000000"/>
+          <w:sz w:val="22"/>
+          <w:szCs w:val="22"/>
+          <w:shd w:fill="auto" w:val="clear"/>
+          <w:vertAlign w:val="baseline"/>
+          <w:rtl w:val="0"/>
+        </w:rPr>
+        <w:br w:type="textWrapping"/>
+        <w:br w:type="textWrapping"/>
+      </w:r>
       <w:r>
         <w:rPr>
           <w:rFonts w:ascii="Calibri" w:cs="Calibri" w:eastAsia="Calibri" w:hAnsi="Calibri"/>
           <w:b w:val="1"/>
           <w:bCs w:val="1"/>
-          <w:color w:val="2f5496"/>
-          <w:sz w:val="28"/>
-          <w:szCs w:val="28"/>
-          <w:shd w:fill="auto" w:val="clear"/>
-          <w:vertAlign w:val="baseline"/>
-          <w:rtl w:val="0"/>
-        </w:rPr>
-        <w:t xml:space="preserve">Education</w:t>
-        <w:br w:type="textWrapping"/>
+          <w:color w:val="000000"/>
+          <w:sz w:val="22"/>
+          <w:szCs w:val="22"/>
+          <w:shd w:fill="auto" w:val="clear"/>
+          <w:vertAlign w:val="baseline"/>
+          <w:rtl w:val="0"/>
+        </w:rPr>
+        <w:t xml:space="preserve">VOIS  (Vodafone </w:t>
+      </w:r>
+      <w:r>
+        <w:rPr>
+          <w:rFonts w:ascii="Calibri" w:cs="Calibri" w:eastAsia="Calibri" w:hAnsi="Calibri"/>
+          <w:b w:val="1"/>
+          <w:bCs w:val="1"/>
+          <w:sz w:val="22"/>
+          <w:szCs w:val="22"/>
+          <w:rtl w:val="0"/>
+        </w:rPr>
+        <w:t xml:space="preserve">Intelligent</w:t>
+      </w:r>
+      <w:r>
+        <w:rPr>
+          <w:rFonts w:ascii="Calibri" w:cs="Calibri" w:eastAsia="Calibri" w:hAnsi="Calibri"/>
+          <w:b w:val="1"/>
+          <w:bCs w:val="1"/>
+          <w:color w:val="000000"/>
+          <w:sz w:val="22"/>
+          <w:szCs w:val="22"/>
+          <w:shd w:fill="auto" w:val="clear"/>
+          <w:vertAlign w:val="baseline"/>
+          <w:rtl w:val="0"/>
+        </w:rPr>
+        <w:t xml:space="preserve"> Solutions)| UK Account Advisor/Subject Matter Expert</w:t>
+      </w:r>
+    </w:p>
+    <w:p>
+      <w:pPr>
+        <w:spacing w:after="80" w:before="0" w:line="259" w:lineRule="auto"/>
+        <w:ind w:left="0" w:right="0" w:firstLine="0"/>
+        <w:jc w:val="left"/>
+        <w:rPr>
+          <w:rFonts w:ascii="Calibri" w:cs="Calibri" w:eastAsia="Calibri" w:hAnsi="Calibri"/>
+          <w:color w:val="767171"/>
+          <w:sz w:val="20"/>
+          <w:szCs w:val="20"/>
+          <w:shd w:fill="auto" w:val="clear"/>
+          <w:vertAlign w:val="baseline"/>
+        </w:rPr>
+      </w:pPr>
+      <w:r>
+        <w:rPr>
+          <w:rFonts w:ascii="Calibri" w:cs="Calibri" w:eastAsia="Calibri" w:hAnsi="Calibri"/>
+          <w:color w:val="767171"/>
+          <w:sz w:val="20"/>
+          <w:szCs w:val="20"/>
+          <w:shd w:fill="auto" w:val="clear"/>
+          <w:vertAlign w:val="baseline"/>
+          <w:rtl w:val="0"/>
+        </w:rPr>
+        <w:t xml:space="preserve">Mar 2018 – Mar 2021| Full-Time</w:t>
+      </w:r>
+    </w:p>
+    <w:p>
+      <w:pPr>
+        <w:spacing w:after="80" w:before="0" w:line="259" w:lineRule="auto"/>
+        <w:ind w:left="0" w:right="0" w:firstLine="0"/>
+        <w:jc w:val="left"/>
+        <w:rPr>
+          <w:rFonts w:ascii="Calibri" w:cs="Calibri" w:eastAsia="Calibri" w:hAnsi="Calibri"/>
+          <w:color w:val="000000"/>
+          <w:sz w:val="22"/>
+          <w:szCs w:val="22"/>
+          <w:shd w:fill="auto" w:val="clear"/>
+          <w:vertAlign w:val="baseline"/>
+        </w:rPr>
+      </w:pPr>
+      <w:r>
+        <w:rPr>
+          <w:rFonts w:ascii="Calibri" w:cs="Calibri" w:eastAsia="Calibri" w:hAnsi="Calibri"/>
+          <w:color w:val="000000"/>
+          <w:sz w:val="22"/>
+          <w:szCs w:val="22"/>
+          <w:shd w:fill="auto" w:val="clear"/>
+          <w:vertAlign w:val="baseline"/>
+          <w:rtl w:val="0"/>
+        </w:rPr>
+        <w:t xml:space="preserve">Responsibilities:</w:t>
       </w:r>
     </w:p>
     <w:p>
@@ -2115,80 +2018,23 @@
         <w:rPr>
           <w:rFonts w:ascii="Calibri" w:cs="Calibri" w:eastAsia="Calibri" w:hAnsi="Calibri"/>
           <w:color w:val="000000"/>
-          <w:sz w:val="20"/>
-          <w:szCs w:val="20"/>
-          <w:shd w:fill="auto" w:val="clear"/>
-          <w:vertAlign w:val="baseline"/>
-        </w:rPr>
-      </w:pPr>
-      <w:r>
-        <w:rPr>
-          <w:rFonts w:ascii="Calibri" w:cs="Calibri" w:eastAsia="Calibri" w:hAnsi="Calibri"/>
-          <w:b w:val="1"/>
-          <w:bCs w:val="1"/>
-          <w:color w:val="000000"/>
-          <w:sz w:val="22"/>
-          <w:szCs w:val="22"/>
-          <w:shd w:fill="auto" w:val="clear"/>
-          <w:vertAlign w:val="baseline"/>
-          <w:rtl w:val="0"/>
-        </w:rPr>
-        <w:t xml:space="preserve">Intensive Training Program – UI/UX Design</w:t>
-      </w:r>
-      <w:r>
-        <w:rPr>
-          <w:rFonts w:ascii="Calibri" w:cs="Calibri" w:eastAsia="Calibri" w:hAnsi="Calibri"/>
-          <w:color w:val="000000"/>
-          <w:sz w:val="20"/>
-          <w:szCs w:val="20"/>
-          <w:shd w:fill="auto" w:val="clear"/>
-          <w:vertAlign w:val="baseline"/>
-          <w:rtl w:val="0"/>
-        </w:rPr>
-        <w:br w:type="textWrapping"/>
-      </w:r>
-      <w:r>
-        <w:rPr>
-          <w:rFonts w:ascii="Calibri" w:cs="Calibri" w:eastAsia="Calibri" w:hAnsi="Calibri"/>
-          <w:i w:val="1"/>
-          <w:iCs w:val="1"/>
-          <w:color w:val="000000"/>
-          <w:sz w:val="22"/>
-          <w:szCs w:val="22"/>
-          <w:shd w:fill="auto" w:val="clear"/>
-          <w:vertAlign w:val="baseline"/>
-          <w:rtl w:val="0"/>
-        </w:rPr>
-        <w:t xml:space="preserve">Information Technology Institute (ITI) – Ministry of Communication and Information Technology</w:t>
-      </w:r>
-      <w:r>
-        <w:rPr>
-          <w:rFonts w:ascii="Calibri" w:cs="Calibri" w:eastAsia="Calibri" w:hAnsi="Calibri"/>
-          <w:color w:val="000000"/>
-          <w:sz w:val="20"/>
-          <w:szCs w:val="20"/>
-          <w:shd w:fill="auto" w:val="clear"/>
-          <w:vertAlign w:val="baseline"/>
-          <w:rtl w:val="0"/>
-        </w:rPr>
-        <w:br w:type="textWrapping"/>
-      </w:r>
-      <w:r>
-        <w:rPr>
-          <w:rFonts w:ascii="Calibri" w:cs="Calibri" w:eastAsia="Calibri" w:hAnsi="Calibri"/>
-          <w:color w:val="000000"/>
-          <w:sz w:val="22"/>
-          <w:szCs w:val="22"/>
-          <w:shd w:fill="auto" w:val="clear"/>
-          <w:vertAlign w:val="baseline"/>
-          <w:rtl w:val="0"/>
-        </w:rPr>
-        <w:t xml:space="preserve">April 2021 – July 2021</w:t>
-      </w:r>
-      <w:r>
-        <w:rPr>
-          <w:rtl w:val="0"/>
-        </w:rPr>
+          <w:sz w:val="22"/>
+          <w:szCs w:val="22"/>
+          <w:shd w:fill="auto" w:val="clear"/>
+          <w:vertAlign w:val="baseline"/>
+        </w:rPr>
+      </w:pPr>
+      <w:r>
+        <w:rPr>
+          <w:rFonts w:ascii="Calibri" w:cs="Calibri" w:eastAsia="Calibri" w:hAnsi="Calibri"/>
+          <w:color w:val="000000"/>
+          <w:sz w:val="22"/>
+          <w:szCs w:val="22"/>
+          <w:shd w:fill="auto" w:val="clear"/>
+          <w:vertAlign w:val="baseline"/>
+          <w:rtl w:val="0"/>
+        </w:rPr>
+        <w:t xml:space="preserve">Documented workflows and identified optimization opportunities, improving team productivity.</w:t>
       </w:r>
     </w:p>
     <w:p>
@@ -2207,88 +2053,31 @@
         <w:rPr>
           <w:rFonts w:ascii="Calibri" w:cs="Calibri" w:eastAsia="Calibri" w:hAnsi="Calibri"/>
           <w:color w:val="000000"/>
-          <w:sz w:val="20"/>
-          <w:szCs w:val="20"/>
-          <w:shd w:fill="auto" w:val="clear"/>
-          <w:vertAlign w:val="baseline"/>
-        </w:rPr>
-      </w:pPr>
-      <w:r>
-        <w:rPr>
-          <w:rFonts w:ascii="Calibri" w:cs="Calibri" w:eastAsia="Calibri" w:hAnsi="Calibri"/>
-          <w:b w:val="1"/>
-          <w:bCs w:val="1"/>
-          <w:color w:val="000000"/>
-          <w:sz w:val="22"/>
-          <w:szCs w:val="22"/>
-          <w:shd w:fill="auto" w:val="clear"/>
-          <w:vertAlign w:val="baseline"/>
-          <w:rtl w:val="0"/>
-        </w:rPr>
-        <w:t xml:space="preserve">Bachelor of Arts – Geographic Information Systems</w:t>
-      </w:r>
-      <w:r>
-        <w:rPr>
-          <w:rFonts w:ascii="Calibri" w:cs="Calibri" w:eastAsia="Calibri" w:hAnsi="Calibri"/>
-          <w:b w:val="1"/>
-          <w:bCs w:val="1"/>
-          <w:color w:val="000000"/>
-          <w:sz w:val="20"/>
-          <w:szCs w:val="20"/>
-          <w:shd w:fill="auto" w:val="clear"/>
-          <w:vertAlign w:val="baseline"/>
-          <w:rtl w:val="0"/>
-        </w:rPr>
-        <w:br w:type="textWrapping"/>
-      </w:r>
-      <w:r>
-        <w:rPr>
-          <w:rFonts w:ascii="Calibri" w:cs="Calibri" w:eastAsia="Calibri" w:hAnsi="Calibri"/>
-          <w:i w:val="1"/>
-          <w:iCs w:val="1"/>
-          <w:color w:val="000000"/>
-          <w:sz w:val="22"/>
-          <w:szCs w:val="22"/>
-          <w:shd w:fill="auto" w:val="clear"/>
-          <w:vertAlign w:val="baseline"/>
-          <w:rtl w:val="0"/>
-        </w:rPr>
-        <w:t xml:space="preserve">Faculty of Arts, King Marriott Academy</w:t>
-      </w:r>
-      <w:r>
-        <w:rPr>
-          <w:rFonts w:ascii="Calibri" w:cs="Calibri" w:eastAsia="Calibri" w:hAnsi="Calibri"/>
-          <w:i w:val="1"/>
-          <w:iCs w:val="1"/>
-          <w:color w:val="000000"/>
-          <w:sz w:val="20"/>
-          <w:szCs w:val="20"/>
-          <w:shd w:fill="auto" w:val="clear"/>
-          <w:vertAlign w:val="baseline"/>
-          <w:rtl w:val="0"/>
-        </w:rPr>
-        <w:br w:type="textWrapping"/>
-      </w:r>
-      <w:r>
-        <w:rPr>
-          <w:rFonts w:ascii="Calibri" w:cs="Calibri" w:eastAsia="Calibri" w:hAnsi="Calibri"/>
-          <w:color w:val="000000"/>
-          <w:sz w:val="22"/>
-          <w:szCs w:val="22"/>
-          <w:shd w:fill="auto" w:val="clear"/>
-          <w:vertAlign w:val="baseline"/>
-          <w:rtl w:val="0"/>
-        </w:rPr>
-        <w:t xml:space="preserve">October 2013 – August 2018</w:t>
-      </w:r>
-      <w:r>
-        <w:rPr>
-          <w:rtl w:val="0"/>
-        </w:rPr>
-      </w:r>
-    </w:p>
-    <w:p>
-      <w:pPr>
+          <w:sz w:val="22"/>
+          <w:szCs w:val="22"/>
+          <w:shd w:fill="auto" w:val="clear"/>
+          <w:vertAlign w:val="baseline"/>
+        </w:rPr>
+      </w:pPr>
+      <w:r>
+        <w:rPr>
+          <w:rFonts w:ascii="Calibri" w:cs="Calibri" w:eastAsia="Calibri" w:hAnsi="Calibri"/>
+          <w:color w:val="000000"/>
+          <w:sz w:val="22"/>
+          <w:szCs w:val="22"/>
+          <w:shd w:fill="auto" w:val="clear"/>
+          <w:vertAlign w:val="baseline"/>
+          <w:rtl w:val="0"/>
+        </w:rPr>
+        <w:t xml:space="preserve">Led the SME team towards improving the Customer Experience Cycle (CXX).</w:t>
+      </w:r>
+    </w:p>
+    <w:p>
+      <w:pPr>
+        <w:tabs>
+          <w:tab w:val="left" w:leader="none" w:pos="1418"/>
+          <w:tab w:val="right" w:leader="none" w:pos="10503"/>
+        </w:tabs>
         <w:spacing w:after="160" w:before="0" w:line="259" w:lineRule="auto"/>
         <w:ind w:left="0" w:right="0" w:firstLine="0"/>
         <w:jc w:val="left"/>
@@ -2302,6 +2091,16 @@
         </w:rPr>
       </w:pPr>
       <w:r>
+        <w:rPr>
+          <w:rtl w:val="0"/>
+        </w:rPr>
+      </w:r>
+    </w:p>
+    <w:p>
+      <w:pPr>
+        <w:spacing w:after="160" w:before="0" w:line="259" w:lineRule="auto"/>
+        <w:ind w:left="0" w:right="0" w:firstLine="0"/>
+        <w:jc w:val="left"/>
         <w:rPr>
           <w:rFonts w:ascii="Calibri" w:cs="Calibri" w:eastAsia="Calibri" w:hAnsi="Calibri"/>
           <w:b w:val="1"/>
@@ -2311,61 +2110,6 @@
           <w:szCs w:val="28"/>
           <w:shd w:fill="auto" w:val="clear"/>
           <w:vertAlign w:val="baseline"/>
-          <w:rtl w:val="0"/>
-        </w:rPr>
-        <w:br w:type="textWrapping"/>
-        <w:t xml:space="preserve">Soft Skills</w:t>
-        <w:br w:type="textWrapping"/>
-      </w:r>
-      <w:r>
-        <w:rPr>
-          <w:rtl w:val="0"/>
-        </w:rPr>
-      </w:r>
-    </w:p>
-    <w:p>
-      <w:pPr>
-        <w:numPr>
-          <w:ilvl w:val="0"/>
-          <w:numId w:val="10"/>
-        </w:numPr>
-        <w:spacing w:after="160" w:before="0" w:line="259" w:lineRule="auto"/>
-        <w:ind w:left="720" w:right="0" w:hanging="360"/>
-        <w:jc w:val="left"/>
-        <w:rPr>
-          <w:rFonts w:ascii="Calibri" w:cs="Calibri" w:eastAsia="Calibri" w:hAnsi="Calibri"/>
-          <w:color w:val="000000"/>
-          <w:sz w:val="22"/>
-          <w:szCs w:val="22"/>
-          <w:shd w:fill="auto" w:val="clear"/>
-          <w:vertAlign w:val="baseline"/>
-        </w:rPr>
-      </w:pPr>
-      <w:r>
-        <w:rPr>
-          <w:rFonts w:ascii="Calibri" w:cs="Calibri" w:eastAsia="Calibri" w:hAnsi="Calibri"/>
-          <w:color w:val="000000"/>
-          <w:sz w:val="22"/>
-          <w:szCs w:val="22"/>
-          <w:shd w:fill="auto" w:val="clear"/>
-          <w:vertAlign w:val="baseline"/>
-          <w:rtl w:val="0"/>
-        </w:rPr>
-        <w:t xml:space="preserve">Time Management | Adaptability | Critical Thinking | Problem Solving | Team Collaboration | Effective Communication | Attention to Detail</w:t>
-      </w:r>
-    </w:p>
-    <w:p>
-      <w:pPr>
-        <w:spacing w:after="160" w:before="0" w:line="259" w:lineRule="auto"/>
-        <w:ind w:left="0" w:right="0" w:firstLine="0"/>
-        <w:jc w:val="left"/>
-        <w:rPr>
-          <w:rFonts w:ascii="Calibri" w:cs="Calibri" w:eastAsia="Calibri" w:hAnsi="Calibri"/>
-          <w:color w:val="000000"/>
-          <w:sz w:val="22"/>
-          <w:szCs w:val="22"/>
-          <w:shd w:fill="auto" w:val="clear"/>
-          <w:vertAlign w:val="baseline"/>
         </w:rPr>
       </w:pPr>
       <w:r>
@@ -2380,8 +2124,226 @@
           <w:vertAlign w:val="baseline"/>
           <w:rtl w:val="0"/>
         </w:rPr>
+        <w:t xml:space="preserve">Education</w:t>
         <w:br w:type="textWrapping"/>
-        <w:t xml:space="preserve">Licenses &amp; Certifications</w:t>
+      </w:r>
+    </w:p>
+    <w:p>
+      <w:pPr>
+        <w:numPr>
+          <w:ilvl w:val="0"/>
+          <w:numId w:val="10"/>
+        </w:numPr>
+        <w:tabs>
+          <w:tab w:val="left" w:leader="none" w:pos="1418"/>
+          <w:tab w:val="right" w:leader="none" w:pos="10503"/>
+        </w:tabs>
+        <w:spacing w:after="160" w:before="0" w:line="259" w:lineRule="auto"/>
+        <w:ind w:left="720" w:right="0" w:hanging="360"/>
+        <w:jc w:val="left"/>
+        <w:rPr>
+          <w:rFonts w:ascii="Calibri" w:cs="Calibri" w:eastAsia="Calibri" w:hAnsi="Calibri"/>
+          <w:color w:val="000000"/>
+          <w:sz w:val="20"/>
+          <w:szCs w:val="20"/>
+          <w:shd w:fill="auto" w:val="clear"/>
+          <w:vertAlign w:val="baseline"/>
+        </w:rPr>
+      </w:pPr>
+      <w:r>
+        <w:rPr>
+          <w:rFonts w:ascii="Calibri" w:cs="Calibri" w:eastAsia="Calibri" w:hAnsi="Calibri"/>
+          <w:b w:val="1"/>
+          <w:bCs w:val="1"/>
+          <w:color w:val="000000"/>
+          <w:sz w:val="22"/>
+          <w:szCs w:val="22"/>
+          <w:shd w:fill="auto" w:val="clear"/>
+          <w:vertAlign w:val="baseline"/>
+          <w:rtl w:val="0"/>
+        </w:rPr>
+        <w:t xml:space="preserve">Intensive Training Program – UI/UX Design</w:t>
+      </w:r>
+      <w:r>
+        <w:rPr>
+          <w:rFonts w:ascii="Calibri" w:cs="Calibri" w:eastAsia="Calibri" w:hAnsi="Calibri"/>
+          <w:color w:val="000000"/>
+          <w:sz w:val="20"/>
+          <w:szCs w:val="20"/>
+          <w:shd w:fill="auto" w:val="clear"/>
+          <w:vertAlign w:val="baseline"/>
+          <w:rtl w:val="0"/>
+        </w:rPr>
+        <w:br w:type="textWrapping"/>
+      </w:r>
+      <w:r>
+        <w:rPr>
+          <w:rFonts w:ascii="Calibri" w:cs="Calibri" w:eastAsia="Calibri" w:hAnsi="Calibri"/>
+          <w:i w:val="1"/>
+          <w:iCs w:val="1"/>
+          <w:color w:val="000000"/>
+          <w:sz w:val="22"/>
+          <w:szCs w:val="22"/>
+          <w:shd w:fill="auto" w:val="clear"/>
+          <w:vertAlign w:val="baseline"/>
+          <w:rtl w:val="0"/>
+        </w:rPr>
+        <w:t xml:space="preserve">Information Technology Institute (ITI) – Ministry of Communication and Information Technology</w:t>
+      </w:r>
+      <w:r>
+        <w:rPr>
+          <w:rFonts w:ascii="Calibri" w:cs="Calibri" w:eastAsia="Calibri" w:hAnsi="Calibri"/>
+          <w:color w:val="000000"/>
+          <w:sz w:val="20"/>
+          <w:szCs w:val="20"/>
+          <w:shd w:fill="auto" w:val="clear"/>
+          <w:vertAlign w:val="baseline"/>
+          <w:rtl w:val="0"/>
+        </w:rPr>
+        <w:br w:type="textWrapping"/>
+      </w:r>
+      <w:r>
+        <w:rPr>
+          <w:rFonts w:ascii="Calibri" w:cs="Calibri" w:eastAsia="Calibri" w:hAnsi="Calibri"/>
+          <w:color w:val="000000"/>
+          <w:sz w:val="22"/>
+          <w:szCs w:val="22"/>
+          <w:shd w:fill="auto" w:val="clear"/>
+          <w:vertAlign w:val="baseline"/>
+          <w:rtl w:val="0"/>
+        </w:rPr>
+        <w:t xml:space="preserve">April 2021 – July 2021</w:t>
+      </w:r>
+      <w:r>
+        <w:rPr>
+          <w:rtl w:val="0"/>
+        </w:rPr>
+      </w:r>
+    </w:p>
+    <w:p>
+      <w:pPr>
+        <w:numPr>
+          <w:ilvl w:val="0"/>
+          <w:numId w:val="10"/>
+        </w:numPr>
+        <w:tabs>
+          <w:tab w:val="left" w:leader="none" w:pos="1418"/>
+          <w:tab w:val="right" w:leader="none" w:pos="10503"/>
+        </w:tabs>
+        <w:spacing w:after="160" w:before="0" w:line="259" w:lineRule="auto"/>
+        <w:ind w:left="720" w:right="0" w:hanging="360"/>
+        <w:jc w:val="left"/>
+        <w:rPr>
+          <w:rFonts w:ascii="Calibri" w:cs="Calibri" w:eastAsia="Calibri" w:hAnsi="Calibri"/>
+          <w:color w:val="000000"/>
+          <w:sz w:val="20"/>
+          <w:szCs w:val="20"/>
+          <w:shd w:fill="auto" w:val="clear"/>
+          <w:vertAlign w:val="baseline"/>
+        </w:rPr>
+      </w:pPr>
+      <w:r>
+        <w:rPr>
+          <w:rFonts w:ascii="Calibri" w:cs="Calibri" w:eastAsia="Calibri" w:hAnsi="Calibri"/>
+          <w:b w:val="1"/>
+          <w:bCs w:val="1"/>
+          <w:color w:val="000000"/>
+          <w:sz w:val="22"/>
+          <w:szCs w:val="22"/>
+          <w:shd w:fill="auto" w:val="clear"/>
+          <w:vertAlign w:val="baseline"/>
+          <w:rtl w:val="0"/>
+        </w:rPr>
+        <w:t xml:space="preserve">Bachelor of Arts – Geographic Information Systems</w:t>
+      </w:r>
+      <w:r>
+        <w:rPr>
+          <w:rFonts w:ascii="Calibri" w:cs="Calibri" w:eastAsia="Calibri" w:hAnsi="Calibri"/>
+          <w:b w:val="1"/>
+          <w:bCs w:val="1"/>
+          <w:color w:val="000000"/>
+          <w:sz w:val="20"/>
+          <w:szCs w:val="20"/>
+          <w:shd w:fill="auto" w:val="clear"/>
+          <w:vertAlign w:val="baseline"/>
+          <w:rtl w:val="0"/>
+        </w:rPr>
+        <w:br w:type="textWrapping"/>
+      </w:r>
+      <w:r>
+        <w:rPr>
+          <w:rFonts w:ascii="Calibri" w:cs="Calibri" w:eastAsia="Calibri" w:hAnsi="Calibri"/>
+          <w:i w:val="1"/>
+          <w:iCs w:val="1"/>
+          <w:color w:val="000000"/>
+          <w:sz w:val="22"/>
+          <w:szCs w:val="22"/>
+          <w:shd w:fill="auto" w:val="clear"/>
+          <w:vertAlign w:val="baseline"/>
+          <w:rtl w:val="0"/>
+        </w:rPr>
+        <w:t xml:space="preserve">Faculty of Arts, King Marriott Academy</w:t>
+      </w:r>
+      <w:r>
+        <w:rPr>
+          <w:rFonts w:ascii="Calibri" w:cs="Calibri" w:eastAsia="Calibri" w:hAnsi="Calibri"/>
+          <w:i w:val="1"/>
+          <w:iCs w:val="1"/>
+          <w:color w:val="000000"/>
+          <w:sz w:val="20"/>
+          <w:szCs w:val="20"/>
+          <w:shd w:fill="auto" w:val="clear"/>
+          <w:vertAlign w:val="baseline"/>
+          <w:rtl w:val="0"/>
+        </w:rPr>
+        <w:br w:type="textWrapping"/>
+      </w:r>
+      <w:r>
+        <w:rPr>
+          <w:rFonts w:ascii="Calibri" w:cs="Calibri" w:eastAsia="Calibri" w:hAnsi="Calibri"/>
+          <w:color w:val="000000"/>
+          <w:sz w:val="22"/>
+          <w:szCs w:val="22"/>
+          <w:shd w:fill="auto" w:val="clear"/>
+          <w:vertAlign w:val="baseline"/>
+          <w:rtl w:val="0"/>
+        </w:rPr>
+        <w:t xml:space="preserve">October 2013 – August 2018</w:t>
+      </w:r>
+      <w:r>
+        <w:rPr>
+          <w:rtl w:val="0"/>
+        </w:rPr>
+      </w:r>
+    </w:p>
+    <w:p>
+      <w:pPr>
+        <w:spacing w:after="160" w:before="0" w:line="259" w:lineRule="auto"/>
+        <w:ind w:left="0" w:right="0" w:firstLine="0"/>
+        <w:jc w:val="left"/>
+        <w:rPr>
+          <w:rFonts w:ascii="Calibri" w:cs="Calibri" w:eastAsia="Calibri" w:hAnsi="Calibri"/>
+          <w:color w:val="000000"/>
+          <w:sz w:val="22"/>
+          <w:szCs w:val="22"/>
+          <w:shd w:fill="auto" w:val="clear"/>
+          <w:vertAlign w:val="baseline"/>
+        </w:rPr>
+      </w:pPr>
+      <w:r>
+        <w:rPr>
+          <w:rFonts w:ascii="Calibri" w:cs="Calibri" w:eastAsia="Calibri" w:hAnsi="Calibri"/>
+          <w:b w:val="1"/>
+          <w:bCs w:val="1"/>
+          <w:color w:val="2f5496"/>
+          <w:sz w:val="28"/>
+          <w:szCs w:val="28"/>
+          <w:shd w:fill="auto" w:val="clear"/>
+          <w:vertAlign w:val="baseline"/>
+          <w:rtl w:val="0"/>
+        </w:rPr>
+        <w:br w:type="textWrapping"/>
+        <w:t xml:space="preserve">Soft Skills</w:t>
         <w:br w:type="textWrapping"/>
       </w:r>
       <w:r>
@@ -2418,100 +2380,7 @@
           <w:vertAlign w:val="baseline"/>
           <w:rtl w:val="0"/>
         </w:rPr>
-        <w:t xml:space="preserve">Digital Product Management - Institute of Management, Technology and Finance</w:t>
-      </w:r>
-    </w:p>
-    <w:p>
-      <w:pPr>
-        <w:numPr>
-          <w:ilvl w:val="0"/>
-          <w:numId w:val="2"/>
-        </w:numPr>
-        <w:spacing w:after="160" w:before="0" w:line="259" w:lineRule="auto"/>
-        <w:ind w:left="720" w:right="0" w:hanging="360"/>
-        <w:jc w:val="left"/>
-        <w:rPr>
-          <w:rFonts w:ascii="Calibri" w:cs="Calibri" w:eastAsia="Calibri" w:hAnsi="Calibri"/>
-          <w:color w:val="000000"/>
-          <w:sz w:val="22"/>
-          <w:szCs w:val="22"/>
-          <w:shd w:fill="auto" w:val="clear"/>
-          <w:vertAlign w:val="baseline"/>
-        </w:rPr>
-      </w:pPr>
-      <w:r>
-        <w:rPr>
-          <w:rFonts w:ascii="Calibri" w:cs="Calibri" w:eastAsia="Calibri" w:hAnsi="Calibri"/>
-          <w:color w:val="000000"/>
-          <w:sz w:val="22"/>
-          <w:szCs w:val="22"/>
-          <w:shd w:fill="auto" w:val="clear"/>
-          <w:vertAlign w:val="baseline"/>
-          <w:rtl w:val="0"/>
-        </w:rPr>
-        <w:t xml:space="preserve">Graphic Design Practice License - Ministry of Manpower Egypt</w:t>
-      </w:r>
-    </w:p>
-    <w:p>
-      <w:pPr>
-        <w:numPr>
-          <w:ilvl w:val="0"/>
-          <w:numId w:val="2"/>
-        </w:numPr>
-        <w:spacing w:after="160" w:before="0" w:line="259" w:lineRule="auto"/>
-        <w:ind w:left="720" w:right="0" w:hanging="360"/>
-        <w:jc w:val="left"/>
-        <w:rPr>
-          <w:rFonts w:ascii="Calibri" w:cs="Calibri" w:eastAsia="Calibri" w:hAnsi="Calibri"/>
-          <w:color w:val="000000"/>
-          <w:sz w:val="22"/>
-          <w:szCs w:val="22"/>
-          <w:shd w:fill="auto" w:val="clear"/>
-          <w:vertAlign w:val="baseline"/>
-        </w:rPr>
-      </w:pPr>
-      <w:r>
-        <w:rPr>
-          <w:rFonts w:ascii="Calibri" w:cs="Calibri" w:eastAsia="Calibri" w:hAnsi="Calibri"/>
-          <w:color w:val="000000"/>
-          <w:sz w:val="22"/>
-          <w:szCs w:val="22"/>
-          <w:shd w:fill="auto" w:val="clear"/>
-          <w:vertAlign w:val="baseline"/>
-          <w:rtl w:val="0"/>
-        </w:rPr>
-        <w:t xml:space="preserve">UX Design Professional - Google</w:t>
-      </w:r>
-    </w:p>
-    <w:p>
-      <w:pPr>
-        <w:numPr>
-          <w:ilvl w:val="0"/>
-          <w:numId w:val="2"/>
-        </w:numPr>
-        <w:spacing w:after="160" w:before="0" w:line="259" w:lineRule="auto"/>
-        <w:ind w:left="720" w:right="0" w:hanging="360"/>
-        <w:jc w:val="left"/>
-        <w:rPr>
-          <w:rFonts w:ascii="Calibri" w:cs="Calibri" w:eastAsia="Calibri" w:hAnsi="Calibri"/>
-          <w:color w:val="000000"/>
-          <w:sz w:val="22"/>
-          <w:szCs w:val="22"/>
-          <w:shd w:fill="auto" w:val="clear"/>
-          <w:vertAlign w:val="baseline"/>
-        </w:rPr>
-      </w:pPr>
-      <w:r>
-        <w:rPr>
-          <w:rFonts w:ascii="Calibri" w:cs="Calibri" w:eastAsia="Calibri" w:hAnsi="Calibri"/>
-          <w:color w:val="000000"/>
-          <w:sz w:val="22"/>
-          <w:szCs w:val="22"/>
-          <w:shd w:fill="auto" w:val="clear"/>
-          <w:vertAlign w:val="baseline"/>
-          <w:rtl w:val="0"/>
-        </w:rPr>
-        <w:t xml:space="preserve">PMP Training Course - Arab Academy for Science, Technology &amp; Maritime Transport .</w:t>
+        <w:t xml:space="preserve">Time Management | Adaptability | Critical Thinking | Problem Solving | Team Collaboration | Effective Communication | Attention to Detail</w:t>
       </w:r>
     </w:p>
     <w:p>
@@ -2529,16 +2398,6 @@
         </w:rPr>
       </w:pPr>
       <w:r>
-        <w:rPr>
-          <w:rtl w:val="0"/>
-        </w:rPr>
-      </w:r>
-    </w:p>
-    <w:p>
-      <w:pPr>
-        <w:spacing w:after="160" w:before="0" w:line="259" w:lineRule="auto"/>
-        <w:ind w:left="0" w:right="0" w:firstLine="0"/>
-        <w:jc w:val="left"/>
         <w:rPr>
           <w:rFonts w:ascii="Calibri" w:cs="Calibri" w:eastAsia="Calibri" w:hAnsi="Calibri"/>
           <w:b w:val="1"/>
@@ -2548,9 +2407,167 @@
           <w:szCs w:val="28"/>
           <w:shd w:fill="auto" w:val="clear"/>
           <w:vertAlign w:val="baseline"/>
-        </w:rPr>
-      </w:pPr>
-      <w:r>
+          <w:rtl w:val="0"/>
+        </w:rPr>
+        <w:br w:type="textWrapping"/>
+        <w:t xml:space="preserve">Licenses &amp; Certifications</w:t>
+        <w:br w:type="textWrapping"/>
+      </w:r>
+      <w:r>
+        <w:rPr>
+          <w:rtl w:val="0"/>
+        </w:rPr>
+      </w:r>
+    </w:p>
+    <w:p>
+      <w:pPr>
+        <w:numPr>
+          <w:ilvl w:val="0"/>
+          <w:numId w:val="3"/>
+        </w:numPr>
+        <w:spacing w:after="160" w:before="0" w:line="259" w:lineRule="auto"/>
+        <w:ind w:left="720" w:right="0" w:hanging="360"/>
+        <w:jc w:val="left"/>
+        <w:rPr>
+          <w:rFonts w:ascii="Calibri" w:cs="Calibri" w:eastAsia="Calibri" w:hAnsi="Calibri"/>
+          <w:color w:val="000000"/>
+          <w:sz w:val="22"/>
+          <w:szCs w:val="22"/>
+          <w:shd w:fill="auto" w:val="clear"/>
+          <w:vertAlign w:val="baseline"/>
+        </w:rPr>
+      </w:pPr>
+      <w:r>
+        <w:rPr>
+          <w:rFonts w:ascii="Calibri" w:cs="Calibri" w:eastAsia="Calibri" w:hAnsi="Calibri"/>
+          <w:color w:val="000000"/>
+          <w:sz w:val="22"/>
+          <w:szCs w:val="22"/>
+          <w:shd w:fill="auto" w:val="clear"/>
+          <w:vertAlign w:val="baseline"/>
+          <w:rtl w:val="0"/>
+        </w:rPr>
+        <w:t xml:space="preserve">Digital Product Management - Institute of Management, Technology and Finance</w:t>
+      </w:r>
+    </w:p>
+    <w:p>
+      <w:pPr>
+        <w:numPr>
+          <w:ilvl w:val="0"/>
+          <w:numId w:val="3"/>
+        </w:numPr>
+        <w:spacing w:after="160" w:before="0" w:line="259" w:lineRule="auto"/>
+        <w:ind w:left="720" w:right="0" w:hanging="360"/>
+        <w:jc w:val="left"/>
+        <w:rPr>
+          <w:rFonts w:ascii="Calibri" w:cs="Calibri" w:eastAsia="Calibri" w:hAnsi="Calibri"/>
+          <w:color w:val="000000"/>
+          <w:sz w:val="22"/>
+          <w:szCs w:val="22"/>
+          <w:shd w:fill="auto" w:val="clear"/>
+          <w:vertAlign w:val="baseline"/>
+        </w:rPr>
+      </w:pPr>
+      <w:r>
+        <w:rPr>
+          <w:rFonts w:ascii="Calibri" w:cs="Calibri" w:eastAsia="Calibri" w:hAnsi="Calibri"/>
+          <w:color w:val="000000"/>
+          <w:sz w:val="22"/>
+          <w:szCs w:val="22"/>
+          <w:shd w:fill="auto" w:val="clear"/>
+          <w:vertAlign w:val="baseline"/>
+          <w:rtl w:val="0"/>
+        </w:rPr>
+        <w:t xml:space="preserve">Graphic Design Practice License - Ministry of Manpower Egypt</w:t>
+      </w:r>
+    </w:p>
+    <w:p>
+      <w:pPr>
+        <w:numPr>
+          <w:ilvl w:val="0"/>
+          <w:numId w:val="3"/>
+        </w:numPr>
+        <w:spacing w:after="160" w:before="0" w:line="259" w:lineRule="auto"/>
+        <w:ind w:left="720" w:right="0" w:hanging="360"/>
+        <w:jc w:val="left"/>
+        <w:rPr>
+          <w:rFonts w:ascii="Calibri" w:cs="Calibri" w:eastAsia="Calibri" w:hAnsi="Calibri"/>
+          <w:color w:val="000000"/>
+          <w:sz w:val="22"/>
+          <w:szCs w:val="22"/>
+          <w:shd w:fill="auto" w:val="clear"/>
+          <w:vertAlign w:val="baseline"/>
+        </w:rPr>
+      </w:pPr>
+      <w:r>
+        <w:rPr>
+          <w:rFonts w:ascii="Calibri" w:cs="Calibri" w:eastAsia="Calibri" w:hAnsi="Calibri"/>
+          <w:color w:val="000000"/>
+          <w:sz w:val="22"/>
+          <w:szCs w:val="22"/>
+          <w:shd w:fill="auto" w:val="clear"/>
+          <w:vertAlign w:val="baseline"/>
+          <w:rtl w:val="0"/>
+        </w:rPr>
+        <w:t xml:space="preserve">UX Design Professional - Google</w:t>
+      </w:r>
+    </w:p>
+    <w:p>
+      <w:pPr>
+        <w:numPr>
+          <w:ilvl w:val="0"/>
+          <w:numId w:val="3"/>
+        </w:numPr>
+        <w:spacing w:after="160" w:before="0" w:line="259" w:lineRule="auto"/>
+        <w:ind w:left="720" w:right="0" w:hanging="360"/>
+        <w:jc w:val="left"/>
+        <w:rPr>
+          <w:rFonts w:ascii="Calibri" w:cs="Calibri" w:eastAsia="Calibri" w:hAnsi="Calibri"/>
+          <w:color w:val="000000"/>
+          <w:sz w:val="22"/>
+          <w:szCs w:val="22"/>
+          <w:shd w:fill="auto" w:val="clear"/>
+          <w:vertAlign w:val="baseline"/>
+        </w:rPr>
+      </w:pPr>
+      <w:r>
+        <w:rPr>
+          <w:rFonts w:ascii="Calibri" w:cs="Calibri" w:eastAsia="Calibri" w:hAnsi="Calibri"/>
+          <w:color w:val="000000"/>
+          <w:sz w:val="22"/>
+          <w:szCs w:val="22"/>
+          <w:shd w:fill="auto" w:val="clear"/>
+          <w:vertAlign w:val="baseline"/>
+          <w:rtl w:val="0"/>
+        </w:rPr>
+        <w:t xml:space="preserve">PMP Training Course - Arab Academy for Science, Technology &amp; Maritime Transport .</w:t>
+      </w:r>
+    </w:p>
+    <w:p>
+      <w:pPr>
+        <w:spacing w:after="160" w:before="0" w:line="259" w:lineRule="auto"/>
+        <w:ind w:left="0" w:right="0" w:firstLine="0"/>
+        <w:jc w:val="left"/>
+        <w:rPr>
+          <w:rFonts w:ascii="Calibri" w:cs="Calibri" w:eastAsia="Calibri" w:hAnsi="Calibri"/>
+          <w:color w:val="000000"/>
+          <w:sz w:val="22"/>
+          <w:szCs w:val="22"/>
+          <w:shd w:fill="auto" w:val="clear"/>
+          <w:vertAlign w:val="baseline"/>
+        </w:rPr>
+      </w:pPr>
+      <w:r>
+        <w:rPr>
+          <w:rtl w:val="0"/>
+        </w:rPr>
+      </w:r>
+    </w:p>
+    <w:p>
+      <w:pPr>
+        <w:spacing w:after="160" w:before="0" w:line="259" w:lineRule="auto"/>
+        <w:ind w:left="0" w:right="0" w:firstLine="0"/>
+        <w:jc w:val="left"/>
         <w:rPr>
           <w:rFonts w:ascii="Calibri" w:cs="Calibri" w:eastAsia="Calibri" w:hAnsi="Calibri"/>
           <w:b w:val="1"/>
@@ -2560,6 +2577,18 @@
           <w:szCs w:val="28"/>
           <w:shd w:fill="auto" w:val="clear"/>
           <w:vertAlign w:val="baseline"/>
+        </w:rPr>
+      </w:pPr>
+      <w:r>
+        <w:rPr>
+          <w:rFonts w:ascii="Calibri" w:cs="Calibri" w:eastAsia="Calibri" w:hAnsi="Calibri"/>
+          <w:b w:val="1"/>
+          <w:bCs w:val="1"/>
+          <w:color w:val="2f5496"/>
+          <w:sz w:val="28"/>
+          <w:szCs w:val="28"/>
+          <w:shd w:fill="auto" w:val="clear"/>
+          <w:vertAlign w:val="baseline"/>
           <w:rtl w:val="0"/>
         </w:rPr>
         <w:t xml:space="preserve">Languages</w:t>
@@ -2570,7 +2599,7 @@
       <w:pPr>
         <w:numPr>
           <w:ilvl w:val="0"/>
-          <w:numId w:val="3"/>
+          <w:numId w:val="4"/>
         </w:numPr>
         <w:tabs>
           <w:tab w:val="left" w:leader="none" w:pos="720"/>
@@ -2604,7 +2633,7 @@
       <w:pPr>
         <w:numPr>
           <w:ilvl w:val="0"/>
-          <w:numId w:val="3"/>
+          <w:numId w:val="4"/>
         </w:numPr>
         <w:tabs>
           <w:tab w:val="left" w:leader="none" w:pos="720"/>
@@ -2715,7 +2744,7 @@
         </w:rPr>
         <w:t xml:space="preserve">Available at </w:t>
       </w:r>
-      <w:hyperlink r:id="rId9">
+      <w:hyperlink r:id="rId12">
         <w:r>
           <w:rPr>
             <w:rFonts w:ascii="Calibri" w:cs="Calibri" w:eastAsia="Calibri" w:hAnsi="Calibri"/>
@@ -4196,4 +4225,19 @@
   </a:objectDefaults>
   <a:extraClrSchemeLst/>
 </a:theme>
+</file>
+
+<file path=customXML/item1.xml><?xml version="1.0" encoding="utf-8"?>
+<go:gDocsCustomXmlDataStorage xmlns:go="http://customooxmlschemas.google.com/" xmlns:r="http://schemas.openxmlformats.org/officeDocument/2006/relationships" uri="GoogleDocsCustomDataVersion2">
+  <go:docsCustomData xmlns:go="http://customooxmlschemas.google.com/" roundtripDataSignature="AMtx7mh8Jllboh9EOYVW95d0ilZ4zfRKsg==">CgMxLjA4AHIhMUdTQlVBNmVGeDh0RmllYWlScDdTOWFqSVhvalJydUJn</go:docsCustomData>
+</go:gDocsCustomXmlDataStorage>
+</file>
+
+<file path=customXML/itemProps1.xml><?xml version="1.0" encoding="utf-8"?>
+<ds:datastoreItem xmlns:ds="http://schemas.openxmlformats.org/officeDocument/2006/customXml" ds:itemID="{11111111-1234-1234-1234-123412341234}">
+  <ds:schemaRefs>
+    <ds:schemaRef ds:uri="http://schemas.openxmlformats.org/officeDocument/2006/relationships"/>
+    <ds:schemaRef ds:uri="http://customooxmlschemas.google.com/"/>
+  </ds:schemaRefs>
+</ds:datastoreItem>
 </file>
</xml_diff>